<commit_message>
add pictures and tables
</commit_message>
<xml_diff>
--- a/Дипломная_работа_ИВТАСбд-41_БорковИван.docx
+++ b/Дипломная_работа_ИВТАСбд-41_БорковИван.docx
@@ -2219,7 +2219,12 @@
         </w:rPr>
         <w:t>Архитектура современных веб-приложений, как правило, разделяется на две основные части: клиентскую и серверную. Клиентская часть, или frontend, отвечает за отображение пользовательского интерфейса, обработку пользовательских действий и первичную валидацию данных. Серверная часть, или backend, обеспечивает обработку бизнес-логики, хранение и обработку данных, а также взаимодействие с внешними сервисами и базами данных.</w:t>
       </w:r>
-      <w:r>
+    </w:p>
+    <w:p>
+      <w:pPr>
+        <w:spacing w:line="360" w:lineRule="auto"/>
+        <w:ind w:firstLine="708" w:firstLineChars="0"/>
+        <w:jc w:val="both"/>
         <w:rPr>
           <w:rFonts w:hint="default" w:ascii="Times New Roman" w:hAnsi="Times New Roman" w:cs="Times New Roman"/>
           <w:b w:val="0"/>
@@ -2230,8 +2235,114 @@
           <w:szCs w:val="28"/>
           <w:lang w:val="en-US"/>
         </w:rPr>
+      </w:pPr>
+    </w:p>
+    <w:p>
+      <w:pPr>
+        <w:spacing w:line="360" w:lineRule="auto"/>
+        <w:jc w:val="center"/>
+        <w:rPr>
+          <w:rFonts w:hint="default" w:ascii="Times New Roman" w:hAnsi="Times New Roman" w:cs="Times New Roman"/>
+          <w:b w:val="0"/>
+          <w:bCs w:val="0"/>
+          <w:i w:val="0"/>
+          <w:iCs w:val="0"/>
+          <w:sz w:val="28"/>
+          <w:szCs w:val="28"/>
+          <w:lang w:val="ru-RU"/>
+        </w:rPr>
+      </w:pPr>
+      <w:r>
+        <w:rPr>
+          <w:rFonts w:ascii="SimSun" w:hAnsi="SimSun" w:eastAsia="SimSun" w:cs="SimSun"/>
+          <w:sz w:val="24"/>
+          <w:szCs w:val="24"/>
+        </w:rPr>
+        <w:drawing>
+          <wp:inline distT="0" distB="0" distL="114300" distR="114300">
+            <wp:extent cx="5933440" cy="3068955"/>
+            <wp:effectExtent l="0" t="0" r="10160" b="17145"/>
+            <wp:docPr id="3" name="Изображение 2" descr="IMG_256"/>
+            <wp:cNvGraphicFramePr>
+              <a:graphicFrameLocks xmlns:a="http://schemas.openxmlformats.org/drawingml/2006/main" noChangeAspect="1"/>
+            </wp:cNvGraphicFramePr>
+            <a:graphic xmlns:a="http://schemas.openxmlformats.org/drawingml/2006/main">
+              <a:graphicData uri="http://schemas.openxmlformats.org/drawingml/2006/picture">
+                <pic:pic xmlns:pic="http://schemas.openxmlformats.org/drawingml/2006/picture">
+                  <pic:nvPicPr>
+                    <pic:cNvPr id="3" name="Изображение 2" descr="IMG_256"/>
+                    <pic:cNvPicPr>
+                      <a:picLocks noChangeAspect="1"/>
+                    </pic:cNvPicPr>
+                  </pic:nvPicPr>
+                  <pic:blipFill>
+                    <a:blip r:embed="rId7"/>
+                    <a:stretch>
+                      <a:fillRect/>
+                    </a:stretch>
+                  </pic:blipFill>
+                  <pic:spPr>
+                    <a:xfrm>
+                      <a:off x="0" y="0"/>
+                      <a:ext cx="5933440" cy="3068955"/>
+                    </a:xfrm>
+                    <a:prstGeom prst="rect">
+                      <a:avLst/>
+                    </a:prstGeom>
+                    <a:noFill/>
+                    <a:ln w="9525">
+                      <a:noFill/>
+                    </a:ln>
+                  </pic:spPr>
+                </pic:pic>
+              </a:graphicData>
+            </a:graphic>
+          </wp:inline>
+        </w:drawing>
+      </w:r>
+      <w:r>
+        <w:rPr>
+          <w:rFonts w:hint="default" w:ascii="Times New Roman" w:hAnsi="Times New Roman" w:cs="Times New Roman"/>
+          <w:b w:val="0"/>
+          <w:bCs w:val="0"/>
+          <w:i w:val="0"/>
+          <w:iCs w:val="0"/>
+          <w:sz w:val="28"/>
+          <w:szCs w:val="28"/>
+          <w:lang w:val="en-US"/>
+        </w:rPr>
         <w:br w:type="textWrapping"/>
       </w:r>
+      <w:r>
+        <w:rPr>
+          <w:rFonts w:hint="default" w:ascii="Times New Roman" w:hAnsi="Times New Roman" w:cs="Times New Roman"/>
+          <w:b w:val="0"/>
+          <w:bCs w:val="0"/>
+          <w:i w:val="0"/>
+          <w:iCs w:val="0"/>
+          <w:sz w:val="28"/>
+          <w:szCs w:val="28"/>
+          <w:lang w:val="ru-RU"/>
+        </w:rPr>
+        <w:t>Рисунок 1.1.1. Схема взаимодействия фронтенда и бекэнда.</w:t>
+      </w:r>
+    </w:p>
+    <w:p>
+      <w:pPr>
+        <w:spacing w:line="360" w:lineRule="auto"/>
+        <w:ind w:firstLine="708" w:firstLineChars="0"/>
+        <w:jc w:val="both"/>
+        <w:rPr>
+          <w:rFonts w:hint="default" w:ascii="Times New Roman" w:hAnsi="Times New Roman" w:cs="Times New Roman"/>
+          <w:b w:val="0"/>
+          <w:bCs w:val="0"/>
+          <w:i w:val="0"/>
+          <w:iCs w:val="0"/>
+          <w:sz w:val="28"/>
+          <w:szCs w:val="28"/>
+          <w:lang w:val="en-US"/>
+        </w:rPr>
+      </w:pPr>
       <w:r>
         <w:rPr>
           <w:rFonts w:hint="default" w:ascii="Times New Roman" w:hAnsi="Times New Roman" w:cs="Times New Roman"/>
@@ -2492,6 +2603,19 @@
           <w:iCs w:val="0"/>
           <w:sz w:val="28"/>
           <w:szCs w:val="28"/>
+          <w:lang w:val="ru-RU"/>
+        </w:rPr>
+        <w:tab/>
+      </w:r>
+      <w:r>
+        <w:rPr>
+          <w:rFonts w:hint="default" w:ascii="Times New Roman" w:hAnsi="Times New Roman" w:cs="Times New Roman"/>
+          <w:b w:val="0"/>
+          <w:bCs w:val="0"/>
+          <w:i w:val="0"/>
+          <w:iCs w:val="0"/>
+          <w:sz w:val="28"/>
+          <w:szCs w:val="28"/>
           <w:lang w:val="en-US"/>
         </w:rPr>
         <w:t>Человеческий фактор может проявляться на различных этапах разработки. Разработчики могут допускать ошибки в логике работы программы, некорректно реализовывать алгоритмы или неправильно обрабатывать исключительные ситуации. Тестировщики могут пропускать дефекты из-за невнимательности, усталости или недостаточной проработки тестовых сценариев. Пользователи, в свою очередь, могут использовать систему не по предполагаемому сценарию, вводить некорректные данные или выполнять действия в нестандартной последовательности. Без систематического тестирования такие ошибки могут привести к сбоям в работе системы, утечке данных, финансовым потерям и снижению доверия пользователей.</w:t>
@@ -2760,6 +2884,86 @@
     <w:p>
       <w:pPr>
         <w:spacing w:line="360" w:lineRule="auto"/>
+        <w:jc w:val="both"/>
+        <w:rPr>
+          <w:rFonts w:ascii="SimSun" w:hAnsi="SimSun" w:eastAsia="SimSun" w:cs="SimSun"/>
+          <w:sz w:val="24"/>
+          <w:szCs w:val="24"/>
+        </w:rPr>
+      </w:pPr>
+      <w:r>
+        <w:rPr>
+          <w:rFonts w:ascii="SimSun" w:hAnsi="SimSun" w:eastAsia="SimSun" w:cs="SimSun"/>
+          <w:sz w:val="24"/>
+          <w:szCs w:val="24"/>
+        </w:rPr>
+        <w:drawing>
+          <wp:inline distT="0" distB="0" distL="114300" distR="114300">
+            <wp:extent cx="5933440" cy="3402965"/>
+            <wp:effectExtent l="0" t="0" r="10160" b="6985"/>
+            <wp:docPr id="4" name="Изображение 3" descr="IMG_256"/>
+            <wp:cNvGraphicFramePr>
+              <a:graphicFrameLocks xmlns:a="http://schemas.openxmlformats.org/drawingml/2006/main" noChangeAspect="1"/>
+            </wp:cNvGraphicFramePr>
+            <a:graphic xmlns:a="http://schemas.openxmlformats.org/drawingml/2006/main">
+              <a:graphicData uri="http://schemas.openxmlformats.org/drawingml/2006/picture">
+                <pic:pic xmlns:pic="http://schemas.openxmlformats.org/drawingml/2006/picture">
+                  <pic:nvPicPr>
+                    <pic:cNvPr id="4" name="Изображение 3" descr="IMG_256"/>
+                    <pic:cNvPicPr>
+                      <a:picLocks noChangeAspect="1"/>
+                    </pic:cNvPicPr>
+                  </pic:nvPicPr>
+                  <pic:blipFill>
+                    <a:blip r:embed="rId8"/>
+                    <a:stretch>
+                      <a:fillRect/>
+                    </a:stretch>
+                  </pic:blipFill>
+                  <pic:spPr>
+                    <a:xfrm>
+                      <a:off x="0" y="0"/>
+                      <a:ext cx="5933440" cy="3402965"/>
+                    </a:xfrm>
+                    <a:prstGeom prst="rect">
+                      <a:avLst/>
+                    </a:prstGeom>
+                    <a:noFill/>
+                    <a:ln w="9525">
+                      <a:noFill/>
+                    </a:ln>
+                  </pic:spPr>
+                </pic:pic>
+              </a:graphicData>
+            </a:graphic>
+          </wp:inline>
+        </w:drawing>
+      </w:r>
+    </w:p>
+    <w:p>
+      <w:pPr>
+        <w:spacing w:line="360" w:lineRule="auto"/>
+        <w:jc w:val="center"/>
+        <w:rPr>
+          <w:rFonts w:hint="default" w:ascii="Times New Roman" w:hAnsi="Times New Roman" w:eastAsia="SimSun" w:cs="Times New Roman"/>
+          <w:sz w:val="28"/>
+          <w:szCs w:val="28"/>
+          <w:lang w:val="ru-RU"/>
+        </w:rPr>
+      </w:pPr>
+      <w:r>
+        <w:rPr>
+          <w:rFonts w:hint="default" w:ascii="Times New Roman" w:hAnsi="Times New Roman" w:eastAsia="SimSun" w:cs="Times New Roman"/>
+          <w:sz w:val="28"/>
+          <w:szCs w:val="28"/>
+          <w:lang w:val="ru-RU"/>
+        </w:rPr>
+        <w:t>Рисунок 1.1.2. Жизненный цикл разработки ПО.</w:t>
+      </w:r>
+    </w:p>
+    <w:p>
+      <w:pPr>
+        <w:spacing w:line="360" w:lineRule="auto"/>
         <w:ind w:firstLine="708" w:firstLineChars="0"/>
         <w:jc w:val="both"/>
         <w:rPr>
@@ -2921,6 +3125,154 @@
           <w:lang w:val="ru-RU"/>
         </w:rPr>
       </w:pPr>
+    </w:p>
+    <w:p>
+      <w:pPr>
+        <w:spacing w:line="360" w:lineRule="auto"/>
+        <w:ind w:firstLine="708" w:firstLineChars="0"/>
+        <w:jc w:val="both"/>
+        <w:rPr>
+          <w:rFonts w:hint="default" w:ascii="Times New Roman" w:hAnsi="Times New Roman" w:cs="Times New Roman"/>
+          <w:b w:val="0"/>
+          <w:bCs w:val="0"/>
+          <w:i w:val="0"/>
+          <w:iCs w:val="0"/>
+          <w:sz w:val="28"/>
+          <w:szCs w:val="28"/>
+          <w:lang w:val="ru-RU"/>
+        </w:rPr>
+      </w:pPr>
+    </w:p>
+    <w:p>
+      <w:pPr>
+        <w:spacing w:line="360" w:lineRule="auto"/>
+        <w:ind w:firstLine="708" w:firstLineChars="0"/>
+        <w:jc w:val="both"/>
+        <w:rPr>
+          <w:rFonts w:hint="default" w:ascii="Times New Roman" w:hAnsi="Times New Roman" w:cs="Times New Roman"/>
+          <w:b w:val="0"/>
+          <w:bCs w:val="0"/>
+          <w:i w:val="0"/>
+          <w:iCs w:val="0"/>
+          <w:sz w:val="28"/>
+          <w:szCs w:val="28"/>
+          <w:lang w:val="ru-RU"/>
+        </w:rPr>
+      </w:pPr>
+    </w:p>
+    <w:p>
+      <w:pPr>
+        <w:spacing w:line="360" w:lineRule="auto"/>
+        <w:ind w:firstLine="708" w:firstLineChars="0"/>
+        <w:jc w:val="both"/>
+        <w:rPr>
+          <w:rFonts w:hint="default" w:ascii="Times New Roman" w:hAnsi="Times New Roman" w:cs="Times New Roman"/>
+          <w:b w:val="0"/>
+          <w:bCs w:val="0"/>
+          <w:i w:val="0"/>
+          <w:iCs w:val="0"/>
+          <w:sz w:val="28"/>
+          <w:szCs w:val="28"/>
+          <w:lang w:val="ru-RU"/>
+        </w:rPr>
+      </w:pPr>
+    </w:p>
+    <w:p>
+      <w:pPr>
+        <w:spacing w:line="360" w:lineRule="auto"/>
+        <w:jc w:val="both"/>
+        <w:rPr>
+          <w:rFonts w:ascii="SimSun" w:hAnsi="SimSun" w:eastAsia="SimSun" w:cs="SimSun"/>
+          <w:sz w:val="24"/>
+          <w:szCs w:val="24"/>
+        </w:rPr>
+      </w:pPr>
+      <w:r>
+        <w:rPr>
+          <w:rFonts w:ascii="SimSun" w:hAnsi="SimSun" w:eastAsia="SimSun" w:cs="SimSun"/>
+          <w:sz w:val="24"/>
+          <w:szCs w:val="24"/>
+        </w:rPr>
+        <w:drawing>
+          <wp:inline distT="0" distB="0" distL="114300" distR="114300">
+            <wp:extent cx="5935345" cy="2130425"/>
+            <wp:effectExtent l="0" t="0" r="8255" b="3175"/>
+            <wp:docPr id="5" name="Изображение 4" descr="IMG_256"/>
+            <wp:cNvGraphicFramePr>
+              <a:graphicFrameLocks xmlns:a="http://schemas.openxmlformats.org/drawingml/2006/main" noChangeAspect="1"/>
+            </wp:cNvGraphicFramePr>
+            <a:graphic xmlns:a="http://schemas.openxmlformats.org/drawingml/2006/main">
+              <a:graphicData uri="http://schemas.openxmlformats.org/drawingml/2006/picture">
+                <pic:pic xmlns:pic="http://schemas.openxmlformats.org/drawingml/2006/picture">
+                  <pic:nvPicPr>
+                    <pic:cNvPr id="5" name="Изображение 4" descr="IMG_256"/>
+                    <pic:cNvPicPr>
+                      <a:picLocks noChangeAspect="1"/>
+                    </pic:cNvPicPr>
+                  </pic:nvPicPr>
+                  <pic:blipFill>
+                    <a:blip r:embed="rId9"/>
+                    <a:stretch>
+                      <a:fillRect/>
+                    </a:stretch>
+                  </pic:blipFill>
+                  <pic:spPr>
+                    <a:xfrm>
+                      <a:off x="0" y="0"/>
+                      <a:ext cx="5935345" cy="2130425"/>
+                    </a:xfrm>
+                    <a:prstGeom prst="rect">
+                      <a:avLst/>
+                    </a:prstGeom>
+                    <a:noFill/>
+                    <a:ln w="9525">
+                      <a:noFill/>
+                    </a:ln>
+                  </pic:spPr>
+                </pic:pic>
+              </a:graphicData>
+            </a:graphic>
+          </wp:inline>
+        </w:drawing>
+      </w:r>
+    </w:p>
+    <w:p>
+      <w:pPr>
+        <w:spacing w:line="360" w:lineRule="auto"/>
+        <w:jc w:val="center"/>
+        <w:rPr>
+          <w:rFonts w:hint="default" w:ascii="Times New Roman" w:hAnsi="Times New Roman" w:eastAsia="SimSun" w:cs="Times New Roman"/>
+          <w:sz w:val="28"/>
+          <w:szCs w:val="28"/>
+          <w:lang w:val="ru-RU"/>
+        </w:rPr>
+      </w:pPr>
+      <w:r>
+        <w:rPr>
+          <w:rFonts w:hint="default" w:ascii="Times New Roman" w:hAnsi="Times New Roman" w:eastAsia="SimSun" w:cs="Times New Roman"/>
+          <w:sz w:val="28"/>
+          <w:szCs w:val="28"/>
+          <w:lang w:val="ru-RU"/>
+        </w:rPr>
+        <w:t>Рисунок 1.1.3. Виды тестирвоания.</w:t>
+      </w:r>
+    </w:p>
+    <w:p>
+      <w:pPr>
+        <w:spacing w:line="360" w:lineRule="auto"/>
+        <w:ind w:firstLine="708" w:firstLineChars="0"/>
+        <w:jc w:val="both"/>
+        <w:rPr>
+          <w:rFonts w:hint="default" w:ascii="Times New Roman" w:hAnsi="Times New Roman" w:cs="Times New Roman"/>
+          <w:b w:val="0"/>
+          <w:bCs w:val="0"/>
+          <w:i w:val="0"/>
+          <w:iCs w:val="0"/>
+          <w:sz w:val="28"/>
+          <w:szCs w:val="28"/>
+          <w:lang w:val="ru-RU"/>
+        </w:rPr>
+      </w:pPr>
       <w:r>
         <w:rPr>
           <w:rFonts w:hint="default" w:ascii="Times New Roman" w:hAnsi="Times New Roman" w:cs="Times New Roman"/>
@@ -3447,6 +3799,1138 @@
     </w:p>
     <w:p>
       <w:pPr>
+        <w:wordWrap w:val="0"/>
+        <w:spacing w:line="360" w:lineRule="auto"/>
+        <w:ind w:firstLine="708" w:firstLineChars="0"/>
+        <w:jc w:val="right"/>
+        <w:rPr>
+          <w:rFonts w:hint="default" w:ascii="Times New Roman" w:hAnsi="Times New Roman" w:cs="Times New Roman"/>
+          <w:b w:val="0"/>
+          <w:bCs w:val="0"/>
+          <w:i w:val="0"/>
+          <w:iCs w:val="0"/>
+          <w:sz w:val="28"/>
+          <w:szCs w:val="28"/>
+          <w:lang w:val="ru-RU"/>
+        </w:rPr>
+      </w:pPr>
+      <w:r>
+        <w:rPr>
+          <w:rFonts w:hint="default" w:ascii="Times New Roman" w:hAnsi="Times New Roman" w:cs="Times New Roman"/>
+          <w:b w:val="0"/>
+          <w:bCs w:val="0"/>
+          <w:i w:val="0"/>
+          <w:iCs w:val="0"/>
+          <w:sz w:val="28"/>
+          <w:szCs w:val="28"/>
+          <w:lang w:val="ru-RU"/>
+        </w:rPr>
+        <w:t>Таблица 1.1.1. Факторы риска в тестировании ПО.</w:t>
+      </w:r>
+    </w:p>
+    <w:tbl>
+      <w:tblPr>
+        <w:tblW w:w="0" w:type="auto"/>
+        <w:tblCellSpacing w:w="15" w:type="dxa"/>
+        <w:tblInd w:w="0" w:type="dxa"/>
+        <w:tblBorders>
+          <w:top w:val="none" w:color="auto" w:sz="0" w:space="0"/>
+          <w:left w:val="none" w:color="auto" w:sz="0" w:space="0"/>
+          <w:bottom w:val="none" w:color="auto" w:sz="0" w:space="0"/>
+          <w:right w:val="none" w:color="auto" w:sz="0" w:space="0"/>
+          <w:insideH w:val="none" w:color="auto" w:sz="0" w:space="0"/>
+          <w:insideV w:val="none" w:color="auto" w:sz="0" w:space="0"/>
+        </w:tblBorders>
+        <w:shd w:val="clear"/>
+        <w:tblLayout w:type="autofit"/>
+        <w:tblCellMar>
+          <w:top w:w="15" w:type="dxa"/>
+          <w:left w:w="15" w:type="dxa"/>
+          <w:bottom w:w="15" w:type="dxa"/>
+          <w:right w:w="15" w:type="dxa"/>
+        </w:tblCellMar>
+      </w:tblPr>
+      <w:tblGrid>
+        <w:gridCol w:w="2377"/>
+        <w:gridCol w:w="2348"/>
+        <w:gridCol w:w="2228"/>
+        <w:gridCol w:w="2552"/>
+      </w:tblGrid>
+      <w:tr>
+        <w:tblPrEx>
+          <w:tblBorders>
+            <w:top w:val="none" w:color="auto" w:sz="0" w:space="0"/>
+            <w:left w:val="none" w:color="auto" w:sz="0" w:space="0"/>
+            <w:bottom w:val="none" w:color="auto" w:sz="0" w:space="0"/>
+            <w:right w:val="none" w:color="auto" w:sz="0" w:space="0"/>
+            <w:insideH w:val="none" w:color="auto" w:sz="0" w:space="0"/>
+            <w:insideV w:val="none" w:color="auto" w:sz="0" w:space="0"/>
+          </w:tblBorders>
+          <w:tblCellMar>
+            <w:top w:w="15" w:type="dxa"/>
+            <w:left w:w="15" w:type="dxa"/>
+            <w:bottom w:w="15" w:type="dxa"/>
+            <w:right w:w="15" w:type="dxa"/>
+          </w:tblCellMar>
+        </w:tblPrEx>
+        <w:trPr>
+          <w:tblHeader/>
+          <w:tblCellSpacing w:w="15" w:type="dxa"/>
+        </w:trPr>
+        <w:tc>
+          <w:tcPr>
+            <w:tcW w:w="0" w:type="auto"/>
+            <w:tcBorders>
+              <w:top w:val="single" w:color="auto" w:sz="4" w:space="0"/>
+              <w:left w:val="single" w:color="auto" w:sz="0" w:space="0"/>
+              <w:bottom w:val="single" w:color="auto" w:sz="4" w:space="0"/>
+              <w:right w:val="single" w:color="auto" w:sz="4" w:space="0"/>
+            </w:tcBorders>
+            <w:shd w:val="clear"/>
+            <w:vAlign w:val="center"/>
+          </w:tcPr>
+          <w:p>
+            <w:pPr>
+              <w:keepNext w:val="0"/>
+              <w:keepLines w:val="0"/>
+              <w:widowControl/>
+              <w:suppressLineNumbers w:val="0"/>
+              <w:spacing w:line="360" w:lineRule="auto"/>
+              <w:jc w:val="center"/>
+              <w:rPr>
+                <w:rFonts w:hint="default" w:ascii="Times New Roman" w:hAnsi="Times New Roman" w:cs="Times New Roman"/>
+                <w:b/>
+                <w:bCs/>
+                <w:sz w:val="28"/>
+                <w:szCs w:val="28"/>
+              </w:rPr>
+            </w:pPr>
+            <w:r>
+              <w:rPr>
+                <w:rFonts w:hint="default" w:ascii="Times New Roman" w:hAnsi="Times New Roman" w:eastAsia="SimSun" w:cs="Times New Roman"/>
+                <w:b/>
+                <w:bCs/>
+                <w:kern w:val="0"/>
+                <w:sz w:val="28"/>
+                <w:szCs w:val="28"/>
+                <w:lang w:val="en-US" w:eastAsia="zh-CN" w:bidi="ar"/>
+              </w:rPr>
+              <w:t>Фактор риска</w:t>
+            </w:r>
+          </w:p>
+        </w:tc>
+        <w:tc>
+          <w:tcPr>
+            <w:tcW w:w="0" w:type="auto"/>
+            <w:tcBorders>
+              <w:top w:val="single" w:color="auto" w:sz="4" w:space="0"/>
+              <w:left w:val="single" w:color="auto" w:sz="4" w:space="0"/>
+              <w:bottom w:val="single" w:color="auto" w:sz="4" w:space="0"/>
+              <w:right w:val="single" w:color="auto" w:sz="4" w:space="0"/>
+            </w:tcBorders>
+            <w:shd w:val="clear"/>
+            <w:vAlign w:val="center"/>
+          </w:tcPr>
+          <w:p>
+            <w:pPr>
+              <w:keepNext w:val="0"/>
+              <w:keepLines w:val="0"/>
+              <w:widowControl/>
+              <w:suppressLineNumbers w:val="0"/>
+              <w:spacing w:line="360" w:lineRule="auto"/>
+              <w:jc w:val="center"/>
+              <w:rPr>
+                <w:rFonts w:hint="default" w:ascii="Times New Roman" w:hAnsi="Times New Roman" w:cs="Times New Roman"/>
+                <w:b/>
+                <w:bCs/>
+                <w:sz w:val="28"/>
+                <w:szCs w:val="28"/>
+              </w:rPr>
+            </w:pPr>
+            <w:r>
+              <w:rPr>
+                <w:rFonts w:hint="default" w:ascii="Times New Roman" w:hAnsi="Times New Roman" w:eastAsia="SimSun" w:cs="Times New Roman"/>
+                <w:b/>
+                <w:bCs/>
+                <w:kern w:val="0"/>
+                <w:sz w:val="28"/>
+                <w:szCs w:val="28"/>
+                <w:lang w:val="en-US" w:eastAsia="zh-CN" w:bidi="ar"/>
+              </w:rPr>
+              <w:t>Проявление проблемы</w:t>
+            </w:r>
+          </w:p>
+        </w:tc>
+        <w:tc>
+          <w:tcPr>
+            <w:tcW w:w="0" w:type="auto"/>
+            <w:tcBorders>
+              <w:top w:val="single" w:color="auto" w:sz="4" w:space="0"/>
+              <w:left w:val="single" w:color="auto" w:sz="4" w:space="0"/>
+              <w:bottom w:val="single" w:color="auto" w:sz="4" w:space="0"/>
+              <w:right w:val="single" w:color="auto" w:sz="4" w:space="0"/>
+            </w:tcBorders>
+            <w:shd w:val="clear"/>
+            <w:vAlign w:val="center"/>
+          </w:tcPr>
+          <w:p>
+            <w:pPr>
+              <w:keepNext w:val="0"/>
+              <w:keepLines w:val="0"/>
+              <w:widowControl/>
+              <w:suppressLineNumbers w:val="0"/>
+              <w:spacing w:line="360" w:lineRule="auto"/>
+              <w:jc w:val="center"/>
+              <w:rPr>
+                <w:rFonts w:hint="default" w:ascii="Times New Roman" w:hAnsi="Times New Roman" w:cs="Times New Roman"/>
+                <w:b/>
+                <w:bCs/>
+                <w:sz w:val="28"/>
+                <w:szCs w:val="28"/>
+              </w:rPr>
+            </w:pPr>
+            <w:r>
+              <w:rPr>
+                <w:rFonts w:hint="default" w:ascii="Times New Roman" w:hAnsi="Times New Roman" w:eastAsia="SimSun" w:cs="Times New Roman"/>
+                <w:b/>
+                <w:bCs/>
+                <w:kern w:val="0"/>
+                <w:sz w:val="28"/>
+                <w:szCs w:val="28"/>
+                <w:lang w:val="en-US" w:eastAsia="zh-CN" w:bidi="ar"/>
+              </w:rPr>
+              <w:t>Возможные последствия</w:t>
+            </w:r>
+          </w:p>
+        </w:tc>
+        <w:tc>
+          <w:tcPr>
+            <w:tcW w:w="0" w:type="auto"/>
+            <w:tcBorders>
+              <w:top w:val="single" w:color="auto" w:sz="4" w:space="0"/>
+              <w:left w:val="single" w:color="auto" w:sz="4" w:space="0"/>
+              <w:bottom w:val="single" w:color="auto" w:sz="4" w:space="0"/>
+              <w:right w:val="single" w:color="auto" w:sz="4" w:space="0"/>
+            </w:tcBorders>
+            <w:shd w:val="clear"/>
+            <w:vAlign w:val="center"/>
+          </w:tcPr>
+          <w:p>
+            <w:pPr>
+              <w:keepNext w:val="0"/>
+              <w:keepLines w:val="0"/>
+              <w:widowControl/>
+              <w:suppressLineNumbers w:val="0"/>
+              <w:spacing w:line="360" w:lineRule="auto"/>
+              <w:jc w:val="center"/>
+              <w:rPr>
+                <w:rFonts w:hint="default" w:ascii="Times New Roman" w:hAnsi="Times New Roman" w:cs="Times New Roman"/>
+                <w:b/>
+                <w:bCs/>
+                <w:sz w:val="28"/>
+                <w:szCs w:val="28"/>
+              </w:rPr>
+            </w:pPr>
+            <w:r>
+              <w:rPr>
+                <w:rFonts w:hint="default" w:ascii="Times New Roman" w:hAnsi="Times New Roman" w:eastAsia="SimSun" w:cs="Times New Roman"/>
+                <w:b/>
+                <w:bCs/>
+                <w:kern w:val="0"/>
+                <w:sz w:val="28"/>
+                <w:szCs w:val="28"/>
+                <w:lang w:val="en-US" w:eastAsia="zh-CN" w:bidi="ar"/>
+              </w:rPr>
+              <w:t>Способы минимизации</w:t>
+            </w:r>
+          </w:p>
+        </w:tc>
+      </w:tr>
+      <w:tr>
+        <w:tblPrEx>
+          <w:tblBorders>
+            <w:top w:val="none" w:color="auto" w:sz="0" w:space="0"/>
+            <w:left w:val="none" w:color="auto" w:sz="0" w:space="0"/>
+            <w:bottom w:val="none" w:color="auto" w:sz="0" w:space="0"/>
+            <w:right w:val="none" w:color="auto" w:sz="0" w:space="0"/>
+            <w:insideH w:val="none" w:color="auto" w:sz="0" w:space="0"/>
+            <w:insideV w:val="none" w:color="auto" w:sz="0" w:space="0"/>
+          </w:tblBorders>
+          <w:shd w:val="clear"/>
+          <w:tblCellMar>
+            <w:top w:w="15" w:type="dxa"/>
+            <w:left w:w="15" w:type="dxa"/>
+            <w:bottom w:w="15" w:type="dxa"/>
+            <w:right w:w="15" w:type="dxa"/>
+          </w:tblCellMar>
+        </w:tblPrEx>
+        <w:trPr>
+          <w:tblCellSpacing w:w="15" w:type="dxa"/>
+        </w:trPr>
+        <w:tc>
+          <w:tcPr>
+            <w:tcW w:w="0" w:type="auto"/>
+            <w:tcBorders>
+              <w:top w:val="single" w:color="auto" w:sz="4" w:space="0"/>
+              <w:left w:val="single" w:color="auto" w:sz="4" w:space="0"/>
+              <w:bottom w:val="single" w:color="auto" w:sz="4" w:space="0"/>
+              <w:right w:val="single" w:color="auto" w:sz="4" w:space="0"/>
+            </w:tcBorders>
+            <w:shd w:val="clear"/>
+            <w:vAlign w:val="center"/>
+          </w:tcPr>
+          <w:p>
+            <w:pPr>
+              <w:keepNext w:val="0"/>
+              <w:keepLines w:val="0"/>
+              <w:widowControl/>
+              <w:suppressLineNumbers w:val="0"/>
+              <w:spacing w:line="360" w:lineRule="auto"/>
+              <w:jc w:val="center"/>
+              <w:rPr>
+                <w:rFonts w:hint="default" w:ascii="Times New Roman" w:hAnsi="Times New Roman" w:cs="Times New Roman"/>
+                <w:sz w:val="24"/>
+                <w:szCs w:val="24"/>
+              </w:rPr>
+            </w:pPr>
+            <w:r>
+              <w:rPr>
+                <w:rFonts w:hint="default" w:ascii="Times New Roman" w:hAnsi="Times New Roman" w:eastAsia="SimSun" w:cs="Times New Roman"/>
+                <w:kern w:val="0"/>
+                <w:sz w:val="24"/>
+                <w:szCs w:val="24"/>
+                <w:lang w:val="en-US" w:eastAsia="zh-CN" w:bidi="ar"/>
+              </w:rPr>
+              <w:t>Человеческий фактор</w:t>
+            </w:r>
+          </w:p>
+        </w:tc>
+        <w:tc>
+          <w:tcPr>
+            <w:tcW w:w="0" w:type="auto"/>
+            <w:tcBorders>
+              <w:top w:val="single" w:color="auto" w:sz="4" w:space="0"/>
+              <w:left w:val="single" w:color="auto" w:sz="4" w:space="0"/>
+              <w:bottom w:val="single" w:color="auto" w:sz="4" w:space="0"/>
+              <w:right w:val="single" w:color="auto" w:sz="4" w:space="0"/>
+            </w:tcBorders>
+            <w:shd w:val="clear"/>
+            <w:vAlign w:val="center"/>
+          </w:tcPr>
+          <w:p>
+            <w:pPr>
+              <w:keepNext w:val="0"/>
+              <w:keepLines w:val="0"/>
+              <w:widowControl/>
+              <w:suppressLineNumbers w:val="0"/>
+              <w:spacing w:line="360" w:lineRule="auto"/>
+              <w:jc w:val="center"/>
+              <w:rPr>
+                <w:rFonts w:hint="default" w:ascii="Times New Roman" w:hAnsi="Times New Roman" w:cs="Times New Roman"/>
+                <w:sz w:val="24"/>
+                <w:szCs w:val="24"/>
+              </w:rPr>
+            </w:pPr>
+            <w:r>
+              <w:rPr>
+                <w:rFonts w:hint="default" w:ascii="Times New Roman" w:hAnsi="Times New Roman" w:eastAsia="SimSun" w:cs="Times New Roman"/>
+                <w:kern w:val="0"/>
+                <w:sz w:val="24"/>
+                <w:szCs w:val="24"/>
+                <w:lang w:val="en-US" w:eastAsia="zh-CN" w:bidi="ar"/>
+              </w:rPr>
+              <w:t>Пропуск дефектов, субъективная оценка UX, усталость тестировщика</w:t>
+            </w:r>
+          </w:p>
+        </w:tc>
+        <w:tc>
+          <w:tcPr>
+            <w:tcW w:w="0" w:type="auto"/>
+            <w:tcBorders>
+              <w:top w:val="single" w:color="auto" w:sz="4" w:space="0"/>
+              <w:left w:val="single" w:color="auto" w:sz="4" w:space="0"/>
+              <w:bottom w:val="single" w:color="auto" w:sz="4" w:space="0"/>
+              <w:right w:val="single" w:color="auto" w:sz="4" w:space="0"/>
+            </w:tcBorders>
+            <w:shd w:val="clear"/>
+            <w:vAlign w:val="center"/>
+          </w:tcPr>
+          <w:p>
+            <w:pPr>
+              <w:keepNext w:val="0"/>
+              <w:keepLines w:val="0"/>
+              <w:widowControl/>
+              <w:suppressLineNumbers w:val="0"/>
+              <w:spacing w:line="360" w:lineRule="auto"/>
+              <w:jc w:val="center"/>
+              <w:rPr>
+                <w:rFonts w:hint="default" w:ascii="Times New Roman" w:hAnsi="Times New Roman" w:cs="Times New Roman"/>
+                <w:sz w:val="24"/>
+                <w:szCs w:val="24"/>
+              </w:rPr>
+            </w:pPr>
+            <w:r>
+              <w:rPr>
+                <w:rFonts w:hint="default" w:ascii="Times New Roman" w:hAnsi="Times New Roman" w:eastAsia="SimSun" w:cs="Times New Roman"/>
+                <w:kern w:val="0"/>
+                <w:sz w:val="24"/>
+                <w:szCs w:val="24"/>
+                <w:lang w:val="en-US" w:eastAsia="zh-CN" w:bidi="ar"/>
+              </w:rPr>
+              <w:t>Снижение качества тестирования, неполное покрытие</w:t>
+            </w:r>
+          </w:p>
+        </w:tc>
+        <w:tc>
+          <w:tcPr>
+            <w:tcW w:w="0" w:type="auto"/>
+            <w:tcBorders>
+              <w:top w:val="single" w:color="auto" w:sz="4" w:space="0"/>
+              <w:left w:val="single" w:color="auto" w:sz="4" w:space="0"/>
+              <w:bottom w:val="single" w:color="auto" w:sz="4" w:space="0"/>
+              <w:right w:val="single" w:color="auto" w:sz="4" w:space="0"/>
+            </w:tcBorders>
+            <w:shd w:val="clear"/>
+            <w:vAlign w:val="center"/>
+          </w:tcPr>
+          <w:p>
+            <w:pPr>
+              <w:keepNext w:val="0"/>
+              <w:keepLines w:val="0"/>
+              <w:widowControl/>
+              <w:suppressLineNumbers w:val="0"/>
+              <w:spacing w:line="360" w:lineRule="auto"/>
+              <w:jc w:val="center"/>
+              <w:rPr>
+                <w:rFonts w:hint="default" w:ascii="Times New Roman" w:hAnsi="Times New Roman" w:cs="Times New Roman"/>
+                <w:sz w:val="24"/>
+                <w:szCs w:val="24"/>
+              </w:rPr>
+            </w:pPr>
+            <w:r>
+              <w:rPr>
+                <w:rFonts w:hint="default" w:ascii="Times New Roman" w:hAnsi="Times New Roman" w:eastAsia="SimSun" w:cs="Times New Roman"/>
+                <w:kern w:val="0"/>
+                <w:sz w:val="24"/>
+                <w:szCs w:val="24"/>
+                <w:lang w:val="en-US" w:eastAsia="zh-CN" w:bidi="ar"/>
+              </w:rPr>
+              <w:t>Использование автотестов, code review тестов, чек-листы</w:t>
+            </w:r>
+          </w:p>
+        </w:tc>
+      </w:tr>
+      <w:tr>
+        <w:tblPrEx>
+          <w:tblBorders>
+            <w:top w:val="none" w:color="auto" w:sz="0" w:space="0"/>
+            <w:left w:val="none" w:color="auto" w:sz="0" w:space="0"/>
+            <w:bottom w:val="none" w:color="auto" w:sz="0" w:space="0"/>
+            <w:right w:val="none" w:color="auto" w:sz="0" w:space="0"/>
+            <w:insideH w:val="none" w:color="auto" w:sz="0" w:space="0"/>
+            <w:insideV w:val="none" w:color="auto" w:sz="0" w:space="0"/>
+          </w:tblBorders>
+          <w:tblCellMar>
+            <w:top w:w="15" w:type="dxa"/>
+            <w:left w:w="15" w:type="dxa"/>
+            <w:bottom w:w="15" w:type="dxa"/>
+            <w:right w:w="15" w:type="dxa"/>
+          </w:tblCellMar>
+        </w:tblPrEx>
+        <w:trPr>
+          <w:tblCellSpacing w:w="15" w:type="dxa"/>
+        </w:trPr>
+        <w:tc>
+          <w:tcPr>
+            <w:tcW w:w="0" w:type="auto"/>
+            <w:tcBorders>
+              <w:top w:val="single" w:color="auto" w:sz="4" w:space="0"/>
+              <w:left w:val="single" w:color="auto" w:sz="4" w:space="0"/>
+              <w:bottom w:val="single" w:color="auto" w:sz="4" w:space="0"/>
+              <w:right w:val="single" w:color="auto" w:sz="4" w:space="0"/>
+            </w:tcBorders>
+            <w:shd w:val="clear"/>
+            <w:vAlign w:val="center"/>
+          </w:tcPr>
+          <w:p>
+            <w:pPr>
+              <w:keepNext w:val="0"/>
+              <w:keepLines w:val="0"/>
+              <w:widowControl/>
+              <w:suppressLineNumbers w:val="0"/>
+              <w:spacing w:line="360" w:lineRule="auto"/>
+              <w:jc w:val="center"/>
+              <w:rPr>
+                <w:rFonts w:hint="default" w:ascii="Times New Roman" w:hAnsi="Times New Roman" w:cs="Times New Roman"/>
+                <w:sz w:val="24"/>
+                <w:szCs w:val="24"/>
+              </w:rPr>
+            </w:pPr>
+            <w:r>
+              <w:rPr>
+                <w:rFonts w:hint="default" w:ascii="Times New Roman" w:hAnsi="Times New Roman" w:eastAsia="SimSun" w:cs="Times New Roman"/>
+                <w:kern w:val="0"/>
+                <w:sz w:val="24"/>
+                <w:szCs w:val="24"/>
+                <w:lang w:val="en-US" w:eastAsia="zh-CN" w:bidi="ar"/>
+              </w:rPr>
+              <w:t>Кроссбраузерность</w:t>
+            </w:r>
+          </w:p>
+        </w:tc>
+        <w:tc>
+          <w:tcPr>
+            <w:tcW w:w="0" w:type="auto"/>
+            <w:tcBorders>
+              <w:top w:val="single" w:color="auto" w:sz="4" w:space="0"/>
+              <w:left w:val="single" w:color="auto" w:sz="4" w:space="0"/>
+              <w:bottom w:val="single" w:color="auto" w:sz="4" w:space="0"/>
+              <w:right w:val="single" w:color="auto" w:sz="4" w:space="0"/>
+            </w:tcBorders>
+            <w:shd w:val="clear"/>
+            <w:vAlign w:val="center"/>
+          </w:tcPr>
+          <w:p>
+            <w:pPr>
+              <w:keepNext w:val="0"/>
+              <w:keepLines w:val="0"/>
+              <w:widowControl/>
+              <w:suppressLineNumbers w:val="0"/>
+              <w:spacing w:line="360" w:lineRule="auto"/>
+              <w:jc w:val="center"/>
+              <w:rPr>
+                <w:rFonts w:hint="default" w:ascii="Times New Roman" w:hAnsi="Times New Roman" w:cs="Times New Roman"/>
+                <w:sz w:val="24"/>
+                <w:szCs w:val="24"/>
+              </w:rPr>
+            </w:pPr>
+            <w:r>
+              <w:rPr>
+                <w:rFonts w:hint="default" w:ascii="Times New Roman" w:hAnsi="Times New Roman" w:eastAsia="SimSun" w:cs="Times New Roman"/>
+                <w:kern w:val="0"/>
+                <w:sz w:val="24"/>
+                <w:szCs w:val="24"/>
+                <w:lang w:val="en-US" w:eastAsia="zh-CN" w:bidi="ar"/>
+              </w:rPr>
+              <w:t>Различия отображения UI в браузерах</w:t>
+            </w:r>
+          </w:p>
+        </w:tc>
+        <w:tc>
+          <w:tcPr>
+            <w:tcW w:w="0" w:type="auto"/>
+            <w:tcBorders>
+              <w:top w:val="single" w:color="auto" w:sz="4" w:space="0"/>
+              <w:left w:val="single" w:color="auto" w:sz="4" w:space="0"/>
+              <w:bottom w:val="single" w:color="auto" w:sz="4" w:space="0"/>
+              <w:right w:val="single" w:color="auto" w:sz="4" w:space="0"/>
+            </w:tcBorders>
+            <w:shd w:val="clear"/>
+            <w:vAlign w:val="center"/>
+          </w:tcPr>
+          <w:p>
+            <w:pPr>
+              <w:keepNext w:val="0"/>
+              <w:keepLines w:val="0"/>
+              <w:widowControl/>
+              <w:suppressLineNumbers w:val="0"/>
+              <w:spacing w:line="360" w:lineRule="auto"/>
+              <w:jc w:val="center"/>
+              <w:rPr>
+                <w:rFonts w:hint="default" w:ascii="Times New Roman" w:hAnsi="Times New Roman" w:cs="Times New Roman"/>
+                <w:sz w:val="24"/>
+                <w:szCs w:val="24"/>
+              </w:rPr>
+            </w:pPr>
+            <w:r>
+              <w:rPr>
+                <w:rFonts w:hint="default" w:ascii="Times New Roman" w:hAnsi="Times New Roman" w:eastAsia="SimSun" w:cs="Times New Roman"/>
+                <w:kern w:val="0"/>
+                <w:sz w:val="24"/>
+                <w:szCs w:val="24"/>
+                <w:lang w:val="en-US" w:eastAsia="zh-CN" w:bidi="ar"/>
+              </w:rPr>
+              <w:t>Ошибки отображения, некорректная работа функций</w:t>
+            </w:r>
+          </w:p>
+        </w:tc>
+        <w:tc>
+          <w:tcPr>
+            <w:tcW w:w="0" w:type="auto"/>
+            <w:tcBorders>
+              <w:top w:val="single" w:color="auto" w:sz="4" w:space="0"/>
+              <w:left w:val="single" w:color="auto" w:sz="4" w:space="0"/>
+              <w:bottom w:val="single" w:color="auto" w:sz="4" w:space="0"/>
+              <w:right w:val="single" w:color="auto" w:sz="4" w:space="0"/>
+            </w:tcBorders>
+            <w:shd w:val="clear"/>
+            <w:vAlign w:val="center"/>
+          </w:tcPr>
+          <w:p>
+            <w:pPr>
+              <w:keepNext w:val="0"/>
+              <w:keepLines w:val="0"/>
+              <w:widowControl/>
+              <w:suppressLineNumbers w:val="0"/>
+              <w:spacing w:line="360" w:lineRule="auto"/>
+              <w:jc w:val="center"/>
+              <w:rPr>
+                <w:rFonts w:hint="default" w:ascii="Times New Roman" w:hAnsi="Times New Roman" w:cs="Times New Roman"/>
+                <w:sz w:val="24"/>
+                <w:szCs w:val="24"/>
+              </w:rPr>
+            </w:pPr>
+            <w:r>
+              <w:rPr>
+                <w:rFonts w:hint="default" w:ascii="Times New Roman" w:hAnsi="Times New Roman" w:eastAsia="SimSun" w:cs="Times New Roman"/>
+                <w:kern w:val="0"/>
+                <w:sz w:val="24"/>
+                <w:szCs w:val="24"/>
+                <w:lang w:val="en-US" w:eastAsia="zh-CN" w:bidi="ar"/>
+              </w:rPr>
+              <w:t>Кроссбраузерное тестирование, Selenium Grid</w:t>
+            </w:r>
+          </w:p>
+        </w:tc>
+      </w:tr>
+      <w:tr>
+        <w:tblPrEx>
+          <w:tblBorders>
+            <w:top w:val="none" w:color="auto" w:sz="0" w:space="0"/>
+            <w:left w:val="none" w:color="auto" w:sz="0" w:space="0"/>
+            <w:bottom w:val="none" w:color="auto" w:sz="0" w:space="0"/>
+            <w:right w:val="none" w:color="auto" w:sz="0" w:space="0"/>
+            <w:insideH w:val="none" w:color="auto" w:sz="0" w:space="0"/>
+            <w:insideV w:val="none" w:color="auto" w:sz="0" w:space="0"/>
+          </w:tblBorders>
+          <w:tblCellMar>
+            <w:top w:w="15" w:type="dxa"/>
+            <w:left w:w="15" w:type="dxa"/>
+            <w:bottom w:w="15" w:type="dxa"/>
+            <w:right w:w="15" w:type="dxa"/>
+          </w:tblCellMar>
+        </w:tblPrEx>
+        <w:trPr>
+          <w:tblCellSpacing w:w="15" w:type="dxa"/>
+        </w:trPr>
+        <w:tc>
+          <w:tcPr>
+            <w:tcW w:w="0" w:type="auto"/>
+            <w:tcBorders>
+              <w:top w:val="single" w:color="auto" w:sz="4" w:space="0"/>
+              <w:left w:val="single" w:color="auto" w:sz="4" w:space="0"/>
+              <w:bottom w:val="single" w:color="auto" w:sz="4" w:space="0"/>
+              <w:right w:val="single" w:color="auto" w:sz="4" w:space="0"/>
+            </w:tcBorders>
+            <w:shd w:val="clear"/>
+            <w:vAlign w:val="center"/>
+          </w:tcPr>
+          <w:p>
+            <w:pPr>
+              <w:keepNext w:val="0"/>
+              <w:keepLines w:val="0"/>
+              <w:widowControl/>
+              <w:suppressLineNumbers w:val="0"/>
+              <w:spacing w:line="360" w:lineRule="auto"/>
+              <w:jc w:val="center"/>
+              <w:rPr>
+                <w:rFonts w:hint="default" w:ascii="Times New Roman" w:hAnsi="Times New Roman" w:cs="Times New Roman"/>
+                <w:sz w:val="24"/>
+                <w:szCs w:val="24"/>
+              </w:rPr>
+            </w:pPr>
+            <w:r>
+              <w:rPr>
+                <w:rFonts w:hint="default" w:ascii="Times New Roman" w:hAnsi="Times New Roman" w:eastAsia="SimSun" w:cs="Times New Roman"/>
+                <w:kern w:val="0"/>
+                <w:sz w:val="24"/>
+                <w:szCs w:val="24"/>
+                <w:lang w:val="en-US" w:eastAsia="zh-CN" w:bidi="ar"/>
+              </w:rPr>
+              <w:t>Зависимость от backend</w:t>
+            </w:r>
+          </w:p>
+        </w:tc>
+        <w:tc>
+          <w:tcPr>
+            <w:tcW w:w="0" w:type="auto"/>
+            <w:tcBorders>
+              <w:top w:val="single" w:color="auto" w:sz="4" w:space="0"/>
+              <w:left w:val="single" w:color="auto" w:sz="4" w:space="0"/>
+              <w:bottom w:val="single" w:color="auto" w:sz="4" w:space="0"/>
+              <w:right w:val="single" w:color="auto" w:sz="4" w:space="0"/>
+            </w:tcBorders>
+            <w:shd w:val="clear"/>
+            <w:vAlign w:val="center"/>
+          </w:tcPr>
+          <w:p>
+            <w:pPr>
+              <w:keepNext w:val="0"/>
+              <w:keepLines w:val="0"/>
+              <w:widowControl/>
+              <w:suppressLineNumbers w:val="0"/>
+              <w:spacing w:line="360" w:lineRule="auto"/>
+              <w:jc w:val="center"/>
+              <w:rPr>
+                <w:rFonts w:hint="default" w:ascii="Times New Roman" w:hAnsi="Times New Roman" w:cs="Times New Roman"/>
+                <w:sz w:val="24"/>
+                <w:szCs w:val="24"/>
+              </w:rPr>
+            </w:pPr>
+            <w:r>
+              <w:rPr>
+                <w:rFonts w:hint="default" w:ascii="Times New Roman" w:hAnsi="Times New Roman" w:eastAsia="SimSun" w:cs="Times New Roman"/>
+                <w:kern w:val="0"/>
+                <w:sz w:val="24"/>
+                <w:szCs w:val="24"/>
+                <w:lang w:val="en-US" w:eastAsia="zh-CN" w:bidi="ar"/>
+              </w:rPr>
+              <w:t>Ошибки API, задержки ответов сервера</w:t>
+            </w:r>
+          </w:p>
+        </w:tc>
+        <w:tc>
+          <w:tcPr>
+            <w:tcW w:w="0" w:type="auto"/>
+            <w:tcBorders>
+              <w:top w:val="single" w:color="auto" w:sz="4" w:space="0"/>
+              <w:left w:val="single" w:color="auto" w:sz="4" w:space="0"/>
+              <w:bottom w:val="single" w:color="auto" w:sz="4" w:space="0"/>
+              <w:right w:val="single" w:color="auto" w:sz="4" w:space="0"/>
+            </w:tcBorders>
+            <w:shd w:val="clear"/>
+            <w:vAlign w:val="center"/>
+          </w:tcPr>
+          <w:p>
+            <w:pPr>
+              <w:keepNext w:val="0"/>
+              <w:keepLines w:val="0"/>
+              <w:widowControl/>
+              <w:suppressLineNumbers w:val="0"/>
+              <w:spacing w:line="360" w:lineRule="auto"/>
+              <w:jc w:val="center"/>
+              <w:rPr>
+                <w:rFonts w:hint="default" w:ascii="Times New Roman" w:hAnsi="Times New Roman" w:cs="Times New Roman"/>
+                <w:sz w:val="24"/>
+                <w:szCs w:val="24"/>
+              </w:rPr>
+            </w:pPr>
+            <w:r>
+              <w:rPr>
+                <w:rFonts w:hint="default" w:ascii="Times New Roman" w:hAnsi="Times New Roman" w:eastAsia="SimSun" w:cs="Times New Roman"/>
+                <w:kern w:val="0"/>
+                <w:sz w:val="24"/>
+                <w:szCs w:val="24"/>
+                <w:lang w:val="en-US" w:eastAsia="zh-CN" w:bidi="ar"/>
+              </w:rPr>
+              <w:t>Некорректное отображение данных, сбои UI</w:t>
+            </w:r>
+          </w:p>
+        </w:tc>
+        <w:tc>
+          <w:tcPr>
+            <w:tcW w:w="0" w:type="auto"/>
+            <w:tcBorders>
+              <w:top w:val="single" w:color="auto" w:sz="4" w:space="0"/>
+              <w:left w:val="single" w:color="auto" w:sz="4" w:space="0"/>
+              <w:bottom w:val="single" w:color="auto" w:sz="4" w:space="0"/>
+              <w:right w:val="single" w:color="auto" w:sz="4" w:space="0"/>
+            </w:tcBorders>
+            <w:shd w:val="clear"/>
+            <w:vAlign w:val="center"/>
+          </w:tcPr>
+          <w:p>
+            <w:pPr>
+              <w:keepNext w:val="0"/>
+              <w:keepLines w:val="0"/>
+              <w:widowControl/>
+              <w:suppressLineNumbers w:val="0"/>
+              <w:spacing w:line="360" w:lineRule="auto"/>
+              <w:jc w:val="center"/>
+              <w:rPr>
+                <w:rFonts w:hint="default" w:ascii="Times New Roman" w:hAnsi="Times New Roman" w:cs="Times New Roman"/>
+                <w:sz w:val="24"/>
+                <w:szCs w:val="24"/>
+              </w:rPr>
+            </w:pPr>
+            <w:r>
+              <w:rPr>
+                <w:rFonts w:hint="default" w:ascii="Times New Roman" w:hAnsi="Times New Roman" w:eastAsia="SimSun" w:cs="Times New Roman"/>
+                <w:kern w:val="0"/>
+                <w:sz w:val="24"/>
+                <w:szCs w:val="24"/>
+                <w:lang w:val="en-US" w:eastAsia="zh-CN" w:bidi="ar"/>
+              </w:rPr>
+              <w:t>API-тестирование, мокирование сервисов</w:t>
+            </w:r>
+          </w:p>
+        </w:tc>
+      </w:tr>
+      <w:tr>
+        <w:tblPrEx>
+          <w:tblBorders>
+            <w:top w:val="none" w:color="auto" w:sz="0" w:space="0"/>
+            <w:left w:val="none" w:color="auto" w:sz="0" w:space="0"/>
+            <w:bottom w:val="none" w:color="auto" w:sz="0" w:space="0"/>
+            <w:right w:val="none" w:color="auto" w:sz="0" w:space="0"/>
+            <w:insideH w:val="none" w:color="auto" w:sz="0" w:space="0"/>
+            <w:insideV w:val="none" w:color="auto" w:sz="0" w:space="0"/>
+          </w:tblBorders>
+          <w:tblCellMar>
+            <w:top w:w="15" w:type="dxa"/>
+            <w:left w:w="15" w:type="dxa"/>
+            <w:bottom w:w="15" w:type="dxa"/>
+            <w:right w:w="15" w:type="dxa"/>
+          </w:tblCellMar>
+        </w:tblPrEx>
+        <w:trPr>
+          <w:tblCellSpacing w:w="15" w:type="dxa"/>
+        </w:trPr>
+        <w:tc>
+          <w:tcPr>
+            <w:tcW w:w="0" w:type="auto"/>
+            <w:tcBorders>
+              <w:top w:val="single" w:color="auto" w:sz="4" w:space="0"/>
+              <w:left w:val="single" w:color="auto" w:sz="4" w:space="0"/>
+              <w:bottom w:val="single" w:color="auto" w:sz="4" w:space="0"/>
+              <w:right w:val="single" w:color="auto" w:sz="4" w:space="0"/>
+            </w:tcBorders>
+            <w:shd w:val="clear"/>
+            <w:vAlign w:val="center"/>
+          </w:tcPr>
+          <w:p>
+            <w:pPr>
+              <w:keepNext w:val="0"/>
+              <w:keepLines w:val="0"/>
+              <w:widowControl/>
+              <w:suppressLineNumbers w:val="0"/>
+              <w:spacing w:line="360" w:lineRule="auto"/>
+              <w:jc w:val="center"/>
+              <w:rPr>
+                <w:rFonts w:hint="default" w:ascii="Times New Roman" w:hAnsi="Times New Roman" w:cs="Times New Roman"/>
+                <w:sz w:val="24"/>
+                <w:szCs w:val="24"/>
+              </w:rPr>
+            </w:pPr>
+            <w:r>
+              <w:rPr>
+                <w:rFonts w:hint="default" w:ascii="Times New Roman" w:hAnsi="Times New Roman" w:eastAsia="SimSun" w:cs="Times New Roman"/>
+                <w:kern w:val="0"/>
+                <w:sz w:val="24"/>
+                <w:szCs w:val="24"/>
+                <w:lang w:val="en-US" w:eastAsia="zh-CN" w:bidi="ar"/>
+              </w:rPr>
+              <w:t>Частые изменения UI</w:t>
+            </w:r>
+          </w:p>
+        </w:tc>
+        <w:tc>
+          <w:tcPr>
+            <w:tcW w:w="0" w:type="auto"/>
+            <w:tcBorders>
+              <w:top w:val="single" w:color="auto" w:sz="4" w:space="0"/>
+              <w:left w:val="single" w:color="auto" w:sz="4" w:space="0"/>
+              <w:bottom w:val="single" w:color="auto" w:sz="4" w:space="0"/>
+              <w:right w:val="single" w:color="auto" w:sz="4" w:space="0"/>
+            </w:tcBorders>
+            <w:shd w:val="clear"/>
+            <w:vAlign w:val="center"/>
+          </w:tcPr>
+          <w:p>
+            <w:pPr>
+              <w:keepNext w:val="0"/>
+              <w:keepLines w:val="0"/>
+              <w:widowControl/>
+              <w:suppressLineNumbers w:val="0"/>
+              <w:spacing w:line="360" w:lineRule="auto"/>
+              <w:jc w:val="center"/>
+              <w:rPr>
+                <w:rFonts w:hint="default" w:ascii="Times New Roman" w:hAnsi="Times New Roman" w:cs="Times New Roman"/>
+                <w:sz w:val="24"/>
+                <w:szCs w:val="24"/>
+              </w:rPr>
+            </w:pPr>
+            <w:r>
+              <w:rPr>
+                <w:rFonts w:hint="default" w:ascii="Times New Roman" w:hAnsi="Times New Roman" w:eastAsia="SimSun" w:cs="Times New Roman"/>
+                <w:kern w:val="0"/>
+                <w:sz w:val="24"/>
+                <w:szCs w:val="24"/>
+                <w:lang w:val="en-US" w:eastAsia="zh-CN" w:bidi="ar"/>
+              </w:rPr>
+              <w:t>Частые правки интерфейса</w:t>
+            </w:r>
+          </w:p>
+        </w:tc>
+        <w:tc>
+          <w:tcPr>
+            <w:tcW w:w="0" w:type="auto"/>
+            <w:tcBorders>
+              <w:top w:val="single" w:color="auto" w:sz="4" w:space="0"/>
+              <w:left w:val="single" w:color="auto" w:sz="4" w:space="0"/>
+              <w:bottom w:val="single" w:color="auto" w:sz="4" w:space="0"/>
+              <w:right w:val="single" w:color="auto" w:sz="4" w:space="0"/>
+            </w:tcBorders>
+            <w:shd w:val="clear"/>
+            <w:vAlign w:val="center"/>
+          </w:tcPr>
+          <w:p>
+            <w:pPr>
+              <w:keepNext w:val="0"/>
+              <w:keepLines w:val="0"/>
+              <w:widowControl/>
+              <w:suppressLineNumbers w:val="0"/>
+              <w:spacing w:line="360" w:lineRule="auto"/>
+              <w:jc w:val="center"/>
+              <w:rPr>
+                <w:rFonts w:hint="default" w:ascii="Times New Roman" w:hAnsi="Times New Roman" w:cs="Times New Roman"/>
+                <w:sz w:val="24"/>
+                <w:szCs w:val="24"/>
+              </w:rPr>
+            </w:pPr>
+            <w:r>
+              <w:rPr>
+                <w:rFonts w:hint="default" w:ascii="Times New Roman" w:hAnsi="Times New Roman" w:eastAsia="SimSun" w:cs="Times New Roman"/>
+                <w:kern w:val="0"/>
+                <w:sz w:val="24"/>
+                <w:szCs w:val="24"/>
+                <w:lang w:val="en-US" w:eastAsia="zh-CN" w:bidi="ar"/>
+              </w:rPr>
+              <w:t>Ломаются тесты, растёт стоимость поддержки</w:t>
+            </w:r>
+          </w:p>
+        </w:tc>
+        <w:tc>
+          <w:tcPr>
+            <w:tcW w:w="0" w:type="auto"/>
+            <w:tcBorders>
+              <w:top w:val="single" w:color="auto" w:sz="4" w:space="0"/>
+              <w:left w:val="single" w:color="auto" w:sz="4" w:space="0"/>
+              <w:bottom w:val="single" w:color="auto" w:sz="4" w:space="0"/>
+              <w:right w:val="single" w:color="auto" w:sz="4" w:space="0"/>
+            </w:tcBorders>
+            <w:shd w:val="clear"/>
+            <w:vAlign w:val="center"/>
+          </w:tcPr>
+          <w:p>
+            <w:pPr>
+              <w:keepNext w:val="0"/>
+              <w:keepLines w:val="0"/>
+              <w:widowControl/>
+              <w:suppressLineNumbers w:val="0"/>
+              <w:spacing w:line="360" w:lineRule="auto"/>
+              <w:jc w:val="center"/>
+              <w:rPr>
+                <w:rFonts w:hint="default" w:ascii="Times New Roman" w:hAnsi="Times New Roman" w:cs="Times New Roman"/>
+                <w:sz w:val="24"/>
+                <w:szCs w:val="24"/>
+              </w:rPr>
+            </w:pPr>
+            <w:r>
+              <w:rPr>
+                <w:rFonts w:hint="default" w:ascii="Times New Roman" w:hAnsi="Times New Roman" w:eastAsia="SimSun" w:cs="Times New Roman"/>
+                <w:kern w:val="0"/>
+                <w:sz w:val="24"/>
+                <w:szCs w:val="24"/>
+                <w:lang w:val="en-US" w:eastAsia="zh-CN" w:bidi="ar"/>
+              </w:rPr>
+              <w:t>Page Object Pattern, стабильные локаторы</w:t>
+            </w:r>
+          </w:p>
+        </w:tc>
+      </w:tr>
+      <w:tr>
+        <w:tblPrEx>
+          <w:tblBorders>
+            <w:top w:val="none" w:color="auto" w:sz="0" w:space="0"/>
+            <w:left w:val="none" w:color="auto" w:sz="0" w:space="0"/>
+            <w:bottom w:val="none" w:color="auto" w:sz="0" w:space="0"/>
+            <w:right w:val="none" w:color="auto" w:sz="0" w:space="0"/>
+            <w:insideH w:val="none" w:color="auto" w:sz="0" w:space="0"/>
+            <w:insideV w:val="none" w:color="auto" w:sz="0" w:space="0"/>
+          </w:tblBorders>
+          <w:tblCellMar>
+            <w:top w:w="15" w:type="dxa"/>
+            <w:left w:w="15" w:type="dxa"/>
+            <w:bottom w:w="15" w:type="dxa"/>
+            <w:right w:w="15" w:type="dxa"/>
+          </w:tblCellMar>
+        </w:tblPrEx>
+        <w:trPr>
+          <w:tblCellSpacing w:w="15" w:type="dxa"/>
+        </w:trPr>
+        <w:tc>
+          <w:tcPr>
+            <w:tcW w:w="0" w:type="auto"/>
+            <w:tcBorders>
+              <w:top w:val="single" w:color="auto" w:sz="4" w:space="0"/>
+              <w:left w:val="single" w:color="auto" w:sz="4" w:space="0"/>
+              <w:bottom w:val="single" w:color="auto" w:sz="4" w:space="0"/>
+              <w:right w:val="single" w:color="auto" w:sz="4" w:space="0"/>
+            </w:tcBorders>
+            <w:shd w:val="clear"/>
+            <w:vAlign w:val="center"/>
+          </w:tcPr>
+          <w:p>
+            <w:pPr>
+              <w:keepNext w:val="0"/>
+              <w:keepLines w:val="0"/>
+              <w:widowControl/>
+              <w:suppressLineNumbers w:val="0"/>
+              <w:spacing w:line="360" w:lineRule="auto"/>
+              <w:jc w:val="center"/>
+              <w:rPr>
+                <w:rFonts w:hint="default" w:ascii="Times New Roman" w:hAnsi="Times New Roman" w:cs="Times New Roman"/>
+                <w:sz w:val="24"/>
+                <w:szCs w:val="24"/>
+              </w:rPr>
+            </w:pPr>
+            <w:r>
+              <w:rPr>
+                <w:rFonts w:hint="default" w:ascii="Times New Roman" w:hAnsi="Times New Roman" w:eastAsia="SimSun" w:cs="Times New Roman"/>
+                <w:kern w:val="0"/>
+                <w:sz w:val="24"/>
+                <w:szCs w:val="24"/>
+                <w:lang w:val="en-US" w:eastAsia="zh-CN" w:bidi="ar"/>
+              </w:rPr>
+              <w:t>Сложность пользовательских сценариев</w:t>
+            </w:r>
+          </w:p>
+        </w:tc>
+        <w:tc>
+          <w:tcPr>
+            <w:tcW w:w="0" w:type="auto"/>
+            <w:tcBorders>
+              <w:top w:val="single" w:color="auto" w:sz="4" w:space="0"/>
+              <w:left w:val="single" w:color="auto" w:sz="4" w:space="0"/>
+              <w:bottom w:val="single" w:color="auto" w:sz="4" w:space="0"/>
+              <w:right w:val="single" w:color="auto" w:sz="4" w:space="0"/>
+            </w:tcBorders>
+            <w:shd w:val="clear"/>
+            <w:vAlign w:val="center"/>
+          </w:tcPr>
+          <w:p>
+            <w:pPr>
+              <w:keepNext w:val="0"/>
+              <w:keepLines w:val="0"/>
+              <w:widowControl/>
+              <w:suppressLineNumbers w:val="0"/>
+              <w:spacing w:line="360" w:lineRule="auto"/>
+              <w:jc w:val="center"/>
+              <w:rPr>
+                <w:rFonts w:hint="default" w:ascii="Times New Roman" w:hAnsi="Times New Roman" w:cs="Times New Roman"/>
+                <w:sz w:val="24"/>
+                <w:szCs w:val="24"/>
+              </w:rPr>
+            </w:pPr>
+            <w:r>
+              <w:rPr>
+                <w:rFonts w:hint="default" w:ascii="Times New Roman" w:hAnsi="Times New Roman" w:eastAsia="SimSun" w:cs="Times New Roman"/>
+                <w:kern w:val="0"/>
+                <w:sz w:val="24"/>
+                <w:szCs w:val="24"/>
+                <w:lang w:val="en-US" w:eastAsia="zh-CN" w:bidi="ar"/>
+              </w:rPr>
+              <w:t>Большое количество вариантов поведения</w:t>
+            </w:r>
+          </w:p>
+        </w:tc>
+        <w:tc>
+          <w:tcPr>
+            <w:tcW w:w="0" w:type="auto"/>
+            <w:tcBorders>
+              <w:top w:val="single" w:color="auto" w:sz="4" w:space="0"/>
+              <w:left w:val="single" w:color="auto" w:sz="4" w:space="0"/>
+              <w:bottom w:val="single" w:color="auto" w:sz="4" w:space="0"/>
+              <w:right w:val="single" w:color="auto" w:sz="4" w:space="0"/>
+            </w:tcBorders>
+            <w:shd w:val="clear"/>
+            <w:vAlign w:val="center"/>
+          </w:tcPr>
+          <w:p>
+            <w:pPr>
+              <w:keepNext w:val="0"/>
+              <w:keepLines w:val="0"/>
+              <w:widowControl/>
+              <w:suppressLineNumbers w:val="0"/>
+              <w:spacing w:line="360" w:lineRule="auto"/>
+              <w:jc w:val="center"/>
+              <w:rPr>
+                <w:rFonts w:hint="default" w:ascii="Times New Roman" w:hAnsi="Times New Roman" w:cs="Times New Roman"/>
+                <w:sz w:val="24"/>
+                <w:szCs w:val="24"/>
+              </w:rPr>
+            </w:pPr>
+            <w:r>
+              <w:rPr>
+                <w:rFonts w:hint="default" w:ascii="Times New Roman" w:hAnsi="Times New Roman" w:eastAsia="SimSun" w:cs="Times New Roman"/>
+                <w:kern w:val="0"/>
+                <w:sz w:val="24"/>
+                <w:szCs w:val="24"/>
+                <w:lang w:val="en-US" w:eastAsia="zh-CN" w:bidi="ar"/>
+              </w:rPr>
+              <w:t>Неполное покрытие тестами</w:t>
+            </w:r>
+          </w:p>
+        </w:tc>
+        <w:tc>
+          <w:tcPr>
+            <w:tcW w:w="0" w:type="auto"/>
+            <w:tcBorders>
+              <w:top w:val="single" w:color="auto" w:sz="4" w:space="0"/>
+              <w:left w:val="single" w:color="auto" w:sz="4" w:space="0"/>
+              <w:bottom w:val="single" w:color="auto" w:sz="4" w:space="0"/>
+              <w:right w:val="single" w:color="auto" w:sz="4" w:space="0"/>
+            </w:tcBorders>
+            <w:shd w:val="clear"/>
+            <w:vAlign w:val="center"/>
+          </w:tcPr>
+          <w:p>
+            <w:pPr>
+              <w:keepNext w:val="0"/>
+              <w:keepLines w:val="0"/>
+              <w:widowControl/>
+              <w:suppressLineNumbers w:val="0"/>
+              <w:spacing w:line="360" w:lineRule="auto"/>
+              <w:jc w:val="center"/>
+              <w:rPr>
+                <w:rFonts w:hint="default" w:ascii="Times New Roman" w:hAnsi="Times New Roman" w:cs="Times New Roman"/>
+                <w:sz w:val="24"/>
+                <w:szCs w:val="24"/>
+              </w:rPr>
+            </w:pPr>
+            <w:r>
+              <w:rPr>
+                <w:rFonts w:hint="default" w:ascii="Times New Roman" w:hAnsi="Times New Roman" w:eastAsia="SimSun" w:cs="Times New Roman"/>
+                <w:kern w:val="0"/>
+                <w:sz w:val="24"/>
+                <w:szCs w:val="24"/>
+                <w:lang w:val="en-US" w:eastAsia="zh-CN" w:bidi="ar"/>
+              </w:rPr>
+              <w:t>Приоритизация сценариев, риск-ориентированное тестирование</w:t>
+            </w:r>
+          </w:p>
+        </w:tc>
+      </w:tr>
+    </w:tbl>
+    <w:p>
+      <w:pPr>
+        <w:spacing w:line="360" w:lineRule="auto"/>
+        <w:jc w:val="both"/>
+        <w:rPr>
+          <w:rFonts w:hint="default" w:ascii="Times New Roman" w:hAnsi="Times New Roman" w:cs="Times New Roman"/>
+          <w:b w:val="0"/>
+          <w:bCs w:val="0"/>
+          <w:i w:val="0"/>
+          <w:iCs w:val="0"/>
+          <w:sz w:val="28"/>
+          <w:szCs w:val="28"/>
+          <w:lang w:val="ru-RU"/>
+        </w:rPr>
+      </w:pPr>
+    </w:p>
+    <w:p>
+      <w:pPr>
         <w:spacing w:line="360" w:lineRule="auto"/>
         <w:ind w:firstLine="708" w:firstLineChars="0"/>
         <w:jc w:val="both"/>
@@ -3562,22 +5046,7 @@
           <w:szCs w:val="28"/>
           <w:lang w:val="ru-RU"/>
         </w:rPr>
-        <w:t>Таким образом, тестирование веб-интерфейсов является неотъемлемой частью разработки веб-приложений и требует системного подхода, учитывающего специфику ошибок, проблемы кроссбраузерности, взаимосвязь с серверной логикой, влияние человеческого фактора и необходимость применения автоматизированных методов тест</w:t>
-      </w:r>
-      <w:bookmarkStart w:id="0" w:name="_GoBack"/>
-      <w:bookmarkEnd w:id="0"/>
-      <w:r>
-        <w:rPr>
-          <w:rFonts w:hint="default" w:ascii="Times New Roman" w:hAnsi="Times New Roman" w:cs="Times New Roman"/>
-          <w:b w:val="0"/>
-          <w:bCs w:val="0"/>
-          <w:i w:val="0"/>
-          <w:iCs w:val="0"/>
-          <w:sz w:val="28"/>
-          <w:szCs w:val="28"/>
-          <w:lang w:val="ru-RU"/>
-        </w:rPr>
-        <w:t>ирования.</w:t>
+        <w:t>Таким образом, тестирование веб-интерфейсов является неотъемлемой частью разработки веб-приложений и требует системного подхода, учитывающего специфику ошибок, проблемы кроссбраузерности, взаимосвязь с серверной логикой, влияние человеческого фактора и необходимость применения автоматизированных методов тестирования.</w:t>
       </w:r>
     </w:p>
     <w:p>
@@ -4240,27 +5709,60 @@
           <w:numId w:val="0"/>
         </w:numPr>
         <w:spacing w:after="160" w:line="360" w:lineRule="auto"/>
-        <w:ind w:firstLine="708" w:firstLineChars="0"/>
-        <w:jc w:val="both"/>
-        <w:rPr>
-          <w:rFonts w:hint="default" w:ascii="Times New Roman" w:hAnsi="Times New Roman"/>
-          <w:b w:val="0"/>
-          <w:bCs w:val="0"/>
-          <w:sz w:val="28"/>
-          <w:szCs w:val="28"/>
-          <w:lang w:val="ru-RU"/>
-        </w:rPr>
-      </w:pPr>
-      <w:r>
-        <w:rPr>
-          <w:rFonts w:hint="default" w:ascii="Times New Roman" w:hAnsi="Times New Roman"/>
-          <w:b w:val="0"/>
-          <w:bCs w:val="0"/>
-          <w:sz w:val="28"/>
-          <w:szCs w:val="28"/>
-          <w:lang w:val="ru-RU"/>
-        </w:rPr>
-        <w:t>Модульные автотесты предназначены для проверки отдельных компонентов или методов программы в изоляции от остальных частей системы. Такие тесты позволяют выявлять ошибки на ранних этапах разработки, обеспечивая корректность работы базовой логики приложения. Модульные автотесты отличаются высокой скоростью выполнения и простотой поддержки, что делает их важной частью процесса разработки.</w:t>
+        <w:jc w:val="both"/>
+        <w:rPr>
+          <w:rFonts w:ascii="SimSun" w:hAnsi="SimSun" w:eastAsia="SimSun" w:cs="SimSun"/>
+          <w:sz w:val="24"/>
+          <w:szCs w:val="24"/>
+        </w:rPr>
+      </w:pPr>
+      <w:r>
+        <w:rPr>
+          <w:rFonts w:ascii="SimSun" w:hAnsi="SimSun" w:eastAsia="SimSun" w:cs="SimSun"/>
+          <w:sz w:val="24"/>
+          <w:szCs w:val="24"/>
+        </w:rPr>
+        <w:drawing>
+          <wp:inline distT="0" distB="0" distL="114300" distR="114300">
+            <wp:extent cx="5925820" cy="4444365"/>
+            <wp:effectExtent l="0" t="0" r="17780" b="13335"/>
+            <wp:docPr id="6" name="Изображение 5" descr="IMG_256"/>
+            <wp:cNvGraphicFramePr>
+              <a:graphicFrameLocks xmlns:a="http://schemas.openxmlformats.org/drawingml/2006/main" noChangeAspect="1"/>
+            </wp:cNvGraphicFramePr>
+            <a:graphic xmlns:a="http://schemas.openxmlformats.org/drawingml/2006/main">
+              <a:graphicData uri="http://schemas.openxmlformats.org/drawingml/2006/picture">
+                <pic:pic xmlns:pic="http://schemas.openxmlformats.org/drawingml/2006/picture">
+                  <pic:nvPicPr>
+                    <pic:cNvPr id="6" name="Изображение 5" descr="IMG_256"/>
+                    <pic:cNvPicPr>
+                      <a:picLocks noChangeAspect="1"/>
+                    </pic:cNvPicPr>
+                  </pic:nvPicPr>
+                  <pic:blipFill>
+                    <a:blip r:embed="rId10"/>
+                    <a:stretch>
+                      <a:fillRect/>
+                    </a:stretch>
+                  </pic:blipFill>
+                  <pic:spPr>
+                    <a:xfrm>
+                      <a:off x="0" y="0"/>
+                      <a:ext cx="5925820" cy="4444365"/>
+                    </a:xfrm>
+                    <a:prstGeom prst="rect">
+                      <a:avLst/>
+                    </a:prstGeom>
+                    <a:noFill/>
+                    <a:ln w="9525">
+                      <a:noFill/>
+                    </a:ln>
+                  </pic:spPr>
+                </pic:pic>
+              </a:graphicData>
+            </a:graphic>
+          </wp:inline>
+        </w:drawing>
       </w:r>
     </w:p>
     <w:p>
@@ -4270,27 +5772,22 @@
           <w:numId w:val="0"/>
         </w:numPr>
         <w:spacing w:after="160" w:line="360" w:lineRule="auto"/>
-        <w:ind w:firstLine="708" w:firstLineChars="0"/>
-        <w:jc w:val="both"/>
-        <w:rPr>
-          <w:rFonts w:hint="default" w:ascii="Times New Roman" w:hAnsi="Times New Roman"/>
-          <w:b w:val="0"/>
-          <w:bCs w:val="0"/>
-          <w:sz w:val="28"/>
-          <w:szCs w:val="28"/>
-          <w:lang w:val="ru-RU"/>
-        </w:rPr>
-      </w:pPr>
-      <w:r>
-        <w:rPr>
-          <w:rFonts w:hint="default" w:ascii="Times New Roman" w:hAnsi="Times New Roman"/>
-          <w:b w:val="0"/>
-          <w:bCs w:val="0"/>
-          <w:sz w:val="28"/>
-          <w:szCs w:val="28"/>
-          <w:lang w:val="ru-RU"/>
-        </w:rPr>
-        <w:t>Интеграционные автотесты направлены на проверку корректности взаимодействия между несколькими модулями или компонентами системы. В рамках интеграционного тестирования проверяется обмен данными между слоями приложения, взаимодействие с базами данных и внешними сервисами. Эти тесты позволяют выявлять ошибки, которые невозможно обнаружить на уровне отдельных модулей.</w:t>
+        <w:jc w:val="center"/>
+        <w:rPr>
+          <w:rFonts w:hint="default" w:ascii="Times New Roman" w:hAnsi="Times New Roman" w:eastAsia="SimSun" w:cs="Times New Roman"/>
+          <w:sz w:val="28"/>
+          <w:szCs w:val="28"/>
+          <w:lang w:val="ru-RU"/>
+        </w:rPr>
+      </w:pPr>
+      <w:r>
+        <w:rPr>
+          <w:rFonts w:hint="default" w:ascii="Times New Roman" w:hAnsi="Times New Roman" w:eastAsia="SimSun" w:cs="Times New Roman"/>
+          <w:sz w:val="28"/>
+          <w:szCs w:val="28"/>
+          <w:lang w:val="ru-RU"/>
+        </w:rPr>
+        <w:t>Рисунок 1.2.1. Пирамида тестирования.</w:t>
       </w:r>
     </w:p>
     <w:p>
@@ -4320,7 +5817,7 @@
           <w:szCs w:val="28"/>
           <w:lang w:val="ru-RU"/>
         </w:rPr>
-        <w:t>UI-автотесты ориентированы на проверку пользовательского интерфейса веб-приложения. Они имитируют действия реального пользователя, такие как навигация по страницам, ввод данных в формы и выполнение пользовательских сценариев. UI-автотесты позволяют убедиться в корректной работе интерфейса, однако требуют значительных ресурсов на разработку и поддержку, поскольку чувствительны к изменениям в структуре и дизайне интерфейса.</w:t>
+        <w:t>Модульные автотесты предназначены для проверки отдельных компонентов или методов программы в изоляции от остальных частей системы. Такие тесты позволяют выявлять ошибки на ранних этапах разработки, обеспечивая корректность работы базовой логики приложения. Модульные автотесты отличаются высокой скоростью выполнения и простотой поддержки, что делает их важной частью процесса разработки.</w:t>
       </w:r>
     </w:p>
     <w:p>
@@ -4350,7 +5847,7 @@
           <w:szCs w:val="28"/>
           <w:lang w:val="ru-RU"/>
         </w:rPr>
-        <w:t>API-автотесты используются для проверки серверной части приложения и взаимодействия через программные интерфейсы. Такие тесты позволяют проверить корректность обработки запросов, структуру ответов, работу механизмов авторизации и обработку ошибок. API-тестирование является важным этапом обеспечения стабильности backend-компонентов и часто выполняется независимо от пользовательского интерфейса.</w:t>
+        <w:t>Интеграционные автотесты направлены на проверку корректности взаимодействия между несколькими модулями или компонентами системы. В рамках интеграционного тестирования проверяется обмен данными между слоями приложения, взаимодействие с базами данных и внешними сервисами. Эти тесты позволяют выявлять ошибки, которые невозможно обнаружить на уровне отдельных модулей.</w:t>
       </w:r>
     </w:p>
     <w:p>
@@ -4380,7 +5877,7 @@
           <w:szCs w:val="28"/>
           <w:lang w:val="ru-RU"/>
         </w:rPr>
-        <w:t>End-to-end тестирование направлено на проверку полной цепочки работы системы от пользовательского интерфейса до серверной части и базы данных. End-to-end автотесты моделируют реальные пользовательские сценарии и позволяют убедиться, что все компоненты системы корректно взаимодействуют между собой. Несмотря на высокую ценность таких тестов, они обладают высокой стоимостью разработки и исполнения, поэтому применяются выборочно для проверки ключевых бизнес-сценариев.</w:t>
+        <w:t>UI-автотесты ориентированы на проверку пользовательского интерфейса веб-приложения. Они имитируют действия реального пользователя, такие как навигация по страницам, ввод данных в формы и выполнение пользовательских сценариев. UI-автотесты позволяют убедиться в корректной работе интерфейса, однако требуют значительных ресурсов на разработку и поддержку, поскольку чувствительны к изменениям в структуре и дизайне интерфейса.</w:t>
       </w:r>
     </w:p>
     <w:p>
@@ -4410,7 +5907,7 @@
           <w:szCs w:val="28"/>
           <w:lang w:val="ru-RU"/>
         </w:rPr>
-        <w:t>Таким образом, использование различных видов автоматизированного тестирования позволяет обеспечить комплексную проверку программного продукта на всех уровнях его архитектуры и повысить общее качество и надёжность веб-приложений.</w:t>
+        <w:t>API-автотесты используются для проверки серверной части приложения и взаимодействия через программные интерфейсы. Такие тесты позволяют проверить корректность обработки запросов, структуру ответов, работу механизмов авторизации и обработку ошибок. API-тестирование является важным этапом обеспечения стабильности backend-компонентов и часто выполняется независимо от пользовательского интерфейса.</w:t>
       </w:r>
     </w:p>
     <w:p>
@@ -4431,6 +5928,17 @@
           <w:lang w:val="ru-RU"/>
         </w:rPr>
       </w:pPr>
+      <w:r>
+        <w:rPr>
+          <w:rFonts w:hint="default" w:ascii="Times New Roman" w:hAnsi="Times New Roman"/>
+          <w:b w:val="0"/>
+          <w:bCs w:val="0"/>
+          <w:sz w:val="28"/>
+          <w:szCs w:val="28"/>
+          <w:lang w:val="ru-RU"/>
+        </w:rPr>
+        <w:t>End-to-end тестирование направлено на проверку полной цепочки работы системы от пользовательского интерфейса до серверной части и базы данных. End-to-end автотесты моделируют реальные пользовательские сценарии и позволяют убедиться, что все компоненты системы корректно взаимодействуют между собой. Несмотря на высокую ценность таких тестов, они обладают высокой стоимостью разработки и исполнения, поэтому применяются выборочно для проверки ключевых бизнес-сценариев.</w:t>
+      </w:r>
     </w:p>
     <w:p>
       <w:pPr>
@@ -4443,6 +5951,55 @@
         <w:jc w:val="both"/>
         <w:rPr>
           <w:rFonts w:hint="default" w:ascii="Times New Roman" w:hAnsi="Times New Roman"/>
+          <w:b w:val="0"/>
+          <w:bCs w:val="0"/>
+          <w:sz w:val="28"/>
+          <w:szCs w:val="28"/>
+          <w:lang w:val="ru-RU"/>
+        </w:rPr>
+      </w:pPr>
+      <w:r>
+        <w:rPr>
+          <w:rFonts w:hint="default" w:ascii="Times New Roman" w:hAnsi="Times New Roman"/>
+          <w:b w:val="0"/>
+          <w:bCs w:val="0"/>
+          <w:sz w:val="28"/>
+          <w:szCs w:val="28"/>
+          <w:lang w:val="ru-RU"/>
+        </w:rPr>
+        <w:t>Таким образом, использование различных видов автоматизированного тестирования позволяет обеспечить комплексную проверку программного продукта на всех уровнях его архитектуры и повысить общее качество и надёжность веб-приложений.</w:t>
+      </w:r>
+    </w:p>
+    <w:p>
+      <w:pPr>
+        <w:numPr>
+          <w:ilvl w:val="0"/>
+          <w:numId w:val="0"/>
+        </w:numPr>
+        <w:spacing w:after="160" w:line="360" w:lineRule="auto"/>
+        <w:ind w:firstLine="708" w:firstLineChars="0"/>
+        <w:jc w:val="both"/>
+        <w:rPr>
+          <w:rFonts w:hint="default" w:ascii="Times New Roman" w:hAnsi="Times New Roman"/>
+          <w:b w:val="0"/>
+          <w:bCs w:val="0"/>
+          <w:sz w:val="28"/>
+          <w:szCs w:val="28"/>
+          <w:lang w:val="ru-RU"/>
+        </w:rPr>
+      </w:pPr>
+    </w:p>
+    <w:p>
+      <w:pPr>
+        <w:numPr>
+          <w:ilvl w:val="0"/>
+          <w:numId w:val="0"/>
+        </w:numPr>
+        <w:spacing w:after="160" w:line="360" w:lineRule="auto"/>
+        <w:ind w:firstLine="708" w:firstLineChars="0"/>
+        <w:jc w:val="both"/>
+        <w:rPr>
+          <w:rFonts w:hint="default" w:ascii="Times New Roman" w:hAnsi="Times New Roman"/>
           <w:b/>
           <w:bCs/>
           <w:sz w:val="28"/>
@@ -4648,30 +6205,1478 @@
           <w:ilvl w:val="0"/>
           <w:numId w:val="0"/>
         </w:numPr>
+        <w:wordWrap w:val="0"/>
         <w:spacing w:after="160" w:line="360" w:lineRule="auto"/>
         <w:ind w:firstLine="708" w:firstLineChars="0"/>
-        <w:jc w:val="both"/>
-        <w:rPr>
-          <w:rFonts w:hint="default" w:ascii="Times New Roman" w:hAnsi="Times New Roman"/>
-          <w:b w:val="0"/>
-          <w:bCs w:val="0"/>
-          <w:sz w:val="28"/>
-          <w:szCs w:val="28"/>
-          <w:lang w:val="ru-RU"/>
-        </w:rPr>
-      </w:pPr>
-      <w:r>
-        <w:rPr>
-          <w:rFonts w:hint="default" w:ascii="Times New Roman" w:hAnsi="Times New Roman"/>
-          <w:b w:val="0"/>
-          <w:bCs w:val="0"/>
-          <w:sz w:val="28"/>
-          <w:szCs w:val="28"/>
-          <w:lang w:val="ru-RU"/>
-        </w:rPr>
-        <w:t>Таким образом, использование современных средств автоматизированного тестирования позволяет выстроить эффективную и масштабируемую систему контроля качества веб-приложений, интегрированную в процесс разработки и сопровождения программного обеспечения.</w:t>
-      </w:r>
-    </w:p>
+        <w:jc w:val="right"/>
+        <w:rPr>
+          <w:rFonts w:hint="default" w:ascii="Times New Roman" w:hAnsi="Times New Roman"/>
+          <w:b w:val="0"/>
+          <w:bCs w:val="0"/>
+          <w:sz w:val="28"/>
+          <w:szCs w:val="28"/>
+          <w:lang w:val="ru-RU"/>
+        </w:rPr>
+      </w:pPr>
+      <w:r>
+        <w:rPr>
+          <w:rFonts w:hint="default" w:ascii="Times New Roman" w:hAnsi="Times New Roman"/>
+          <w:b w:val="0"/>
+          <w:bCs w:val="0"/>
+          <w:sz w:val="28"/>
+          <w:szCs w:val="28"/>
+          <w:lang w:val="ru-RU"/>
+        </w:rPr>
+        <w:t>Таблица 1.2.1. Средства автоматизированного тестирования.</w:t>
+      </w:r>
+    </w:p>
+    <w:tbl>
+      <w:tblPr>
+        <w:tblW w:w="0" w:type="auto"/>
+        <w:jc w:val="center"/>
+        <w:tblCellSpacing w:w="15" w:type="dxa"/>
+        <w:tblBorders>
+          <w:top w:val="single" w:color="auto" w:sz="4" w:space="0"/>
+          <w:left w:val="single" w:color="auto" w:sz="4" w:space="0"/>
+          <w:bottom w:val="single" w:color="auto" w:sz="4" w:space="0"/>
+          <w:right w:val="single" w:color="auto" w:sz="4" w:space="0"/>
+          <w:insideH w:val="single" w:color="auto" w:sz="4" w:space="0"/>
+          <w:insideV w:val="single" w:color="auto" w:sz="4" w:space="0"/>
+        </w:tblBorders>
+        <w:shd w:val="clear"/>
+        <w:tblLayout w:type="autofit"/>
+        <w:tblCellMar>
+          <w:top w:w="15" w:type="dxa"/>
+          <w:left w:w="15" w:type="dxa"/>
+          <w:bottom w:w="15" w:type="dxa"/>
+          <w:right w:w="15" w:type="dxa"/>
+        </w:tblCellMar>
+      </w:tblPr>
+      <w:tblGrid>
+        <w:gridCol w:w="1697"/>
+        <w:gridCol w:w="1884"/>
+        <w:gridCol w:w="1773"/>
+        <w:gridCol w:w="2336"/>
+        <w:gridCol w:w="1775"/>
+      </w:tblGrid>
+      <w:tr>
+        <w:tblPrEx>
+          <w:tblBorders>
+            <w:top w:val="single" w:color="auto" w:sz="4" w:space="0"/>
+            <w:left w:val="single" w:color="auto" w:sz="4" w:space="0"/>
+            <w:bottom w:val="single" w:color="auto" w:sz="4" w:space="0"/>
+            <w:right w:val="single" w:color="auto" w:sz="4" w:space="0"/>
+            <w:insideH w:val="single" w:color="auto" w:sz="4" w:space="0"/>
+            <w:insideV w:val="single" w:color="auto" w:sz="4" w:space="0"/>
+          </w:tblBorders>
+          <w:shd w:val="clear"/>
+          <w:tblCellMar>
+            <w:top w:w="15" w:type="dxa"/>
+            <w:left w:w="15" w:type="dxa"/>
+            <w:bottom w:w="15" w:type="dxa"/>
+            <w:right w:w="15" w:type="dxa"/>
+          </w:tblCellMar>
+        </w:tblPrEx>
+        <w:trPr>
+          <w:tblHeader/>
+          <w:tblCellSpacing w:w="15" w:type="dxa"/>
+          <w:jc w:val="center"/>
+        </w:trPr>
+        <w:tc>
+          <w:tcPr>
+            <w:tcW w:w="0" w:type="auto"/>
+            <w:shd w:val="clear"/>
+            <w:vAlign w:val="center"/>
+          </w:tcPr>
+          <w:p>
+            <w:pPr>
+              <w:numPr>
+                <w:ilvl w:val="0"/>
+                <w:numId w:val="0"/>
+              </w:numPr>
+              <w:spacing w:after="160" w:line="360" w:lineRule="auto"/>
+              <w:jc w:val="center"/>
+              <w:rPr>
+                <w:rFonts w:hint="default" w:ascii="Times New Roman" w:hAnsi="Times New Roman"/>
+                <w:b/>
+                <w:bCs/>
+                <w:sz w:val="28"/>
+                <w:szCs w:val="28"/>
+                <w:lang w:val="ru-RU"/>
+              </w:rPr>
+            </w:pPr>
+            <w:r>
+              <w:rPr>
+                <w:rFonts w:hint="default" w:ascii="Times New Roman" w:hAnsi="Times New Roman"/>
+                <w:b/>
+                <w:bCs/>
+                <w:sz w:val="28"/>
+                <w:szCs w:val="28"/>
+                <w:lang w:val="ru-RU" w:eastAsia="zh-CN"/>
+              </w:rPr>
+              <w:t>Инструмент</w:t>
+            </w:r>
+          </w:p>
+        </w:tc>
+        <w:tc>
+          <w:tcPr>
+            <w:tcW w:w="0" w:type="auto"/>
+            <w:shd w:val="clear"/>
+            <w:vAlign w:val="center"/>
+          </w:tcPr>
+          <w:p>
+            <w:pPr>
+              <w:numPr>
+                <w:ilvl w:val="0"/>
+                <w:numId w:val="0"/>
+              </w:numPr>
+              <w:spacing w:after="160" w:line="360" w:lineRule="auto"/>
+              <w:jc w:val="center"/>
+              <w:rPr>
+                <w:rFonts w:hint="default" w:ascii="Times New Roman" w:hAnsi="Times New Roman"/>
+                <w:b/>
+                <w:bCs/>
+                <w:sz w:val="28"/>
+                <w:szCs w:val="28"/>
+                <w:lang w:val="ru-RU"/>
+              </w:rPr>
+            </w:pPr>
+            <w:r>
+              <w:rPr>
+                <w:rFonts w:hint="default" w:ascii="Times New Roman" w:hAnsi="Times New Roman"/>
+                <w:b/>
+                <w:bCs/>
+                <w:sz w:val="28"/>
+                <w:szCs w:val="28"/>
+                <w:lang w:val="ru-RU" w:eastAsia="zh-CN"/>
+              </w:rPr>
+              <w:t>Тип тестирования</w:t>
+            </w:r>
+          </w:p>
+        </w:tc>
+        <w:tc>
+          <w:tcPr>
+            <w:tcW w:w="0" w:type="auto"/>
+            <w:shd w:val="clear"/>
+            <w:vAlign w:val="center"/>
+          </w:tcPr>
+          <w:p>
+            <w:pPr>
+              <w:numPr>
+                <w:ilvl w:val="0"/>
+                <w:numId w:val="0"/>
+              </w:numPr>
+              <w:spacing w:after="160" w:line="360" w:lineRule="auto"/>
+              <w:jc w:val="center"/>
+              <w:rPr>
+                <w:rFonts w:hint="default" w:ascii="Times New Roman" w:hAnsi="Times New Roman"/>
+                <w:b/>
+                <w:bCs/>
+                <w:sz w:val="28"/>
+                <w:szCs w:val="28"/>
+                <w:lang w:val="ru-RU"/>
+              </w:rPr>
+            </w:pPr>
+            <w:r>
+              <w:rPr>
+                <w:rFonts w:hint="default" w:ascii="Times New Roman" w:hAnsi="Times New Roman"/>
+                <w:b/>
+                <w:bCs/>
+                <w:sz w:val="28"/>
+                <w:szCs w:val="28"/>
+                <w:lang w:val="ru-RU" w:eastAsia="zh-CN"/>
+              </w:rPr>
+              <w:t>Основное назначение</w:t>
+            </w:r>
+          </w:p>
+        </w:tc>
+        <w:tc>
+          <w:tcPr>
+            <w:tcW w:w="0" w:type="auto"/>
+            <w:shd w:val="clear"/>
+            <w:vAlign w:val="center"/>
+          </w:tcPr>
+          <w:p>
+            <w:pPr>
+              <w:numPr>
+                <w:ilvl w:val="0"/>
+                <w:numId w:val="0"/>
+              </w:numPr>
+              <w:spacing w:after="160" w:line="360" w:lineRule="auto"/>
+              <w:jc w:val="center"/>
+              <w:rPr>
+                <w:rFonts w:hint="default" w:ascii="Times New Roman" w:hAnsi="Times New Roman"/>
+                <w:b/>
+                <w:bCs/>
+                <w:sz w:val="28"/>
+                <w:szCs w:val="28"/>
+                <w:lang w:val="ru-RU"/>
+              </w:rPr>
+            </w:pPr>
+            <w:r>
+              <w:rPr>
+                <w:rFonts w:hint="default" w:ascii="Times New Roman" w:hAnsi="Times New Roman"/>
+                <w:b/>
+                <w:bCs/>
+                <w:sz w:val="28"/>
+                <w:szCs w:val="28"/>
+                <w:lang w:val="ru-RU" w:eastAsia="zh-CN"/>
+              </w:rPr>
+              <w:t>Преимущества</w:t>
+            </w:r>
+          </w:p>
+        </w:tc>
+        <w:tc>
+          <w:tcPr>
+            <w:tcW w:w="0" w:type="auto"/>
+            <w:shd w:val="clear"/>
+            <w:vAlign w:val="center"/>
+          </w:tcPr>
+          <w:p>
+            <w:pPr>
+              <w:numPr>
+                <w:ilvl w:val="0"/>
+                <w:numId w:val="0"/>
+              </w:numPr>
+              <w:spacing w:after="160" w:line="360" w:lineRule="auto"/>
+              <w:jc w:val="center"/>
+              <w:rPr>
+                <w:rFonts w:hint="default" w:ascii="Times New Roman" w:hAnsi="Times New Roman"/>
+                <w:b/>
+                <w:bCs/>
+                <w:sz w:val="28"/>
+                <w:szCs w:val="28"/>
+                <w:lang w:val="ru-RU"/>
+              </w:rPr>
+            </w:pPr>
+            <w:r>
+              <w:rPr>
+                <w:rFonts w:hint="default" w:ascii="Times New Roman" w:hAnsi="Times New Roman"/>
+                <w:b/>
+                <w:bCs/>
+                <w:sz w:val="28"/>
+                <w:szCs w:val="28"/>
+                <w:lang w:val="ru-RU" w:eastAsia="zh-CN"/>
+              </w:rPr>
+              <w:t>Область применения</w:t>
+            </w:r>
+          </w:p>
+        </w:tc>
+      </w:tr>
+      <w:tr>
+        <w:tblPrEx>
+          <w:tblBorders>
+            <w:top w:val="single" w:color="auto" w:sz="4" w:space="0"/>
+            <w:left w:val="single" w:color="auto" w:sz="4" w:space="0"/>
+            <w:bottom w:val="single" w:color="auto" w:sz="4" w:space="0"/>
+            <w:right w:val="single" w:color="auto" w:sz="4" w:space="0"/>
+            <w:insideH w:val="single" w:color="auto" w:sz="4" w:space="0"/>
+            <w:insideV w:val="single" w:color="auto" w:sz="4" w:space="0"/>
+          </w:tblBorders>
+          <w:tblCellMar>
+            <w:top w:w="15" w:type="dxa"/>
+            <w:left w:w="15" w:type="dxa"/>
+            <w:bottom w:w="15" w:type="dxa"/>
+            <w:right w:w="15" w:type="dxa"/>
+          </w:tblCellMar>
+        </w:tblPrEx>
+        <w:trPr>
+          <w:tblCellSpacing w:w="15" w:type="dxa"/>
+          <w:jc w:val="center"/>
+        </w:trPr>
+        <w:tc>
+          <w:tcPr>
+            <w:tcW w:w="0" w:type="auto"/>
+            <w:shd w:val="clear"/>
+            <w:vAlign w:val="center"/>
+          </w:tcPr>
+          <w:p>
+            <w:pPr>
+              <w:numPr>
+                <w:ilvl w:val="0"/>
+                <w:numId w:val="0"/>
+              </w:numPr>
+              <w:spacing w:after="160" w:line="360" w:lineRule="auto"/>
+              <w:jc w:val="center"/>
+              <w:rPr>
+                <w:rFonts w:hint="default" w:ascii="Times New Roman" w:hAnsi="Times New Roman"/>
+                <w:b w:val="0"/>
+                <w:bCs w:val="0"/>
+                <w:sz w:val="24"/>
+                <w:szCs w:val="24"/>
+                <w:lang w:val="ru-RU"/>
+              </w:rPr>
+            </w:pPr>
+            <w:r>
+              <w:rPr>
+                <w:rFonts w:hint="default" w:ascii="Times New Roman" w:hAnsi="Times New Roman"/>
+                <w:b w:val="0"/>
+                <w:bCs w:val="0"/>
+                <w:sz w:val="24"/>
+                <w:szCs w:val="24"/>
+                <w:lang w:val="ru-RU" w:eastAsia="zh-CN"/>
+              </w:rPr>
+              <w:t>Selenium</w:t>
+            </w:r>
+          </w:p>
+        </w:tc>
+        <w:tc>
+          <w:tcPr>
+            <w:tcW w:w="0" w:type="auto"/>
+            <w:shd w:val="clear"/>
+            <w:vAlign w:val="center"/>
+          </w:tcPr>
+          <w:p>
+            <w:pPr>
+              <w:numPr>
+                <w:ilvl w:val="0"/>
+                <w:numId w:val="0"/>
+              </w:numPr>
+              <w:spacing w:after="160" w:line="360" w:lineRule="auto"/>
+              <w:jc w:val="center"/>
+              <w:rPr>
+                <w:rFonts w:hint="default" w:ascii="Times New Roman" w:hAnsi="Times New Roman"/>
+                <w:b w:val="0"/>
+                <w:bCs w:val="0"/>
+                <w:sz w:val="24"/>
+                <w:szCs w:val="24"/>
+                <w:lang w:val="ru-RU"/>
+              </w:rPr>
+            </w:pPr>
+            <w:r>
+              <w:rPr>
+                <w:rFonts w:hint="default" w:ascii="Times New Roman" w:hAnsi="Times New Roman"/>
+                <w:b w:val="0"/>
+                <w:bCs w:val="0"/>
+                <w:sz w:val="24"/>
+                <w:szCs w:val="24"/>
+                <w:lang w:val="ru-RU" w:eastAsia="zh-CN"/>
+              </w:rPr>
+              <w:t>UI-тестирование</w:t>
+            </w:r>
+          </w:p>
+        </w:tc>
+        <w:tc>
+          <w:tcPr>
+            <w:tcW w:w="0" w:type="auto"/>
+            <w:shd w:val="clear"/>
+            <w:vAlign w:val="center"/>
+          </w:tcPr>
+          <w:p>
+            <w:pPr>
+              <w:numPr>
+                <w:ilvl w:val="0"/>
+                <w:numId w:val="0"/>
+              </w:numPr>
+              <w:spacing w:after="160" w:line="360" w:lineRule="auto"/>
+              <w:jc w:val="center"/>
+              <w:rPr>
+                <w:rFonts w:hint="default" w:ascii="Times New Roman" w:hAnsi="Times New Roman"/>
+                <w:b w:val="0"/>
+                <w:bCs w:val="0"/>
+                <w:sz w:val="24"/>
+                <w:szCs w:val="24"/>
+                <w:lang w:val="ru-RU"/>
+              </w:rPr>
+            </w:pPr>
+            <w:r>
+              <w:rPr>
+                <w:rFonts w:hint="default" w:ascii="Times New Roman" w:hAnsi="Times New Roman"/>
+                <w:b w:val="0"/>
+                <w:bCs w:val="0"/>
+                <w:sz w:val="24"/>
+                <w:szCs w:val="24"/>
+                <w:lang w:val="ru-RU" w:eastAsia="zh-CN"/>
+              </w:rPr>
+              <w:t>Автоматизация действий пользователя в браузере</w:t>
+            </w:r>
+          </w:p>
+        </w:tc>
+        <w:tc>
+          <w:tcPr>
+            <w:tcW w:w="0" w:type="auto"/>
+            <w:shd w:val="clear"/>
+            <w:vAlign w:val="center"/>
+          </w:tcPr>
+          <w:p>
+            <w:pPr>
+              <w:numPr>
+                <w:ilvl w:val="0"/>
+                <w:numId w:val="0"/>
+              </w:numPr>
+              <w:spacing w:after="160" w:line="360" w:lineRule="auto"/>
+              <w:jc w:val="center"/>
+              <w:rPr>
+                <w:rFonts w:hint="default" w:ascii="Times New Roman" w:hAnsi="Times New Roman"/>
+                <w:b w:val="0"/>
+                <w:bCs w:val="0"/>
+                <w:sz w:val="24"/>
+                <w:szCs w:val="24"/>
+                <w:lang w:val="ru-RU"/>
+              </w:rPr>
+            </w:pPr>
+            <w:r>
+              <w:rPr>
+                <w:rFonts w:hint="default" w:ascii="Times New Roman" w:hAnsi="Times New Roman"/>
+                <w:b w:val="0"/>
+                <w:bCs w:val="0"/>
+                <w:sz w:val="24"/>
+                <w:szCs w:val="24"/>
+                <w:lang w:val="ru-RU" w:eastAsia="zh-CN"/>
+              </w:rPr>
+              <w:t>Кроссбраузерность, поддержка многих языков</w:t>
+            </w:r>
+          </w:p>
+        </w:tc>
+        <w:tc>
+          <w:tcPr>
+            <w:tcW w:w="0" w:type="auto"/>
+            <w:shd w:val="clear"/>
+            <w:vAlign w:val="center"/>
+          </w:tcPr>
+          <w:p>
+            <w:pPr>
+              <w:numPr>
+                <w:ilvl w:val="0"/>
+                <w:numId w:val="0"/>
+              </w:numPr>
+              <w:spacing w:after="160" w:line="360" w:lineRule="auto"/>
+              <w:jc w:val="center"/>
+              <w:rPr>
+                <w:rFonts w:hint="default" w:ascii="Times New Roman" w:hAnsi="Times New Roman"/>
+                <w:b w:val="0"/>
+                <w:bCs w:val="0"/>
+                <w:sz w:val="24"/>
+                <w:szCs w:val="24"/>
+                <w:lang w:val="ru-RU"/>
+              </w:rPr>
+            </w:pPr>
+            <w:r>
+              <w:rPr>
+                <w:rFonts w:hint="default" w:ascii="Times New Roman" w:hAnsi="Times New Roman"/>
+                <w:b w:val="0"/>
+                <w:bCs w:val="0"/>
+                <w:sz w:val="24"/>
+                <w:szCs w:val="24"/>
+                <w:lang w:val="ru-RU" w:eastAsia="zh-CN"/>
+              </w:rPr>
+              <w:t>Тестирование веб-интерфейсов</w:t>
+            </w:r>
+          </w:p>
+        </w:tc>
+      </w:tr>
+      <w:tr>
+        <w:tblPrEx>
+          <w:tblBorders>
+            <w:top w:val="single" w:color="auto" w:sz="4" w:space="0"/>
+            <w:left w:val="single" w:color="auto" w:sz="4" w:space="0"/>
+            <w:bottom w:val="single" w:color="auto" w:sz="4" w:space="0"/>
+            <w:right w:val="single" w:color="auto" w:sz="4" w:space="0"/>
+            <w:insideH w:val="single" w:color="auto" w:sz="4" w:space="0"/>
+            <w:insideV w:val="single" w:color="auto" w:sz="4" w:space="0"/>
+          </w:tblBorders>
+          <w:tblCellMar>
+            <w:top w:w="15" w:type="dxa"/>
+            <w:left w:w="15" w:type="dxa"/>
+            <w:bottom w:w="15" w:type="dxa"/>
+            <w:right w:w="15" w:type="dxa"/>
+          </w:tblCellMar>
+        </w:tblPrEx>
+        <w:trPr>
+          <w:tblCellSpacing w:w="15" w:type="dxa"/>
+          <w:jc w:val="center"/>
+        </w:trPr>
+        <w:tc>
+          <w:tcPr>
+            <w:tcW w:w="0" w:type="auto"/>
+            <w:shd w:val="clear"/>
+            <w:vAlign w:val="center"/>
+          </w:tcPr>
+          <w:p>
+            <w:pPr>
+              <w:numPr>
+                <w:ilvl w:val="0"/>
+                <w:numId w:val="0"/>
+              </w:numPr>
+              <w:spacing w:after="160" w:line="360" w:lineRule="auto"/>
+              <w:jc w:val="center"/>
+              <w:rPr>
+                <w:rFonts w:hint="default" w:ascii="Times New Roman" w:hAnsi="Times New Roman"/>
+                <w:b w:val="0"/>
+                <w:bCs w:val="0"/>
+                <w:sz w:val="24"/>
+                <w:szCs w:val="24"/>
+                <w:lang w:val="ru-RU"/>
+              </w:rPr>
+            </w:pPr>
+            <w:r>
+              <w:rPr>
+                <w:rFonts w:hint="default" w:ascii="Times New Roman" w:hAnsi="Times New Roman"/>
+                <w:b w:val="0"/>
+                <w:bCs w:val="0"/>
+                <w:sz w:val="24"/>
+                <w:szCs w:val="24"/>
+                <w:lang w:val="ru-RU" w:eastAsia="zh-CN"/>
+              </w:rPr>
+              <w:t>JUnit</w:t>
+            </w:r>
+          </w:p>
+        </w:tc>
+        <w:tc>
+          <w:tcPr>
+            <w:tcW w:w="0" w:type="auto"/>
+            <w:shd w:val="clear"/>
+            <w:vAlign w:val="center"/>
+          </w:tcPr>
+          <w:p>
+            <w:pPr>
+              <w:numPr>
+                <w:ilvl w:val="0"/>
+                <w:numId w:val="0"/>
+              </w:numPr>
+              <w:spacing w:after="160" w:line="360" w:lineRule="auto"/>
+              <w:jc w:val="center"/>
+              <w:rPr>
+                <w:rFonts w:hint="default" w:ascii="Times New Roman" w:hAnsi="Times New Roman"/>
+                <w:b w:val="0"/>
+                <w:bCs w:val="0"/>
+                <w:sz w:val="24"/>
+                <w:szCs w:val="24"/>
+                <w:lang w:val="ru-RU"/>
+              </w:rPr>
+            </w:pPr>
+            <w:r>
+              <w:rPr>
+                <w:rFonts w:hint="default" w:ascii="Times New Roman" w:hAnsi="Times New Roman"/>
+                <w:b w:val="0"/>
+                <w:bCs w:val="0"/>
+                <w:sz w:val="24"/>
+                <w:szCs w:val="24"/>
+                <w:lang w:val="ru-RU" w:eastAsia="zh-CN"/>
+              </w:rPr>
+              <w:t>Модульное тестирование</w:t>
+            </w:r>
+          </w:p>
+        </w:tc>
+        <w:tc>
+          <w:tcPr>
+            <w:tcW w:w="0" w:type="auto"/>
+            <w:shd w:val="clear"/>
+            <w:vAlign w:val="center"/>
+          </w:tcPr>
+          <w:p>
+            <w:pPr>
+              <w:numPr>
+                <w:ilvl w:val="0"/>
+                <w:numId w:val="0"/>
+              </w:numPr>
+              <w:spacing w:after="160" w:line="360" w:lineRule="auto"/>
+              <w:jc w:val="center"/>
+              <w:rPr>
+                <w:rFonts w:hint="default" w:ascii="Times New Roman" w:hAnsi="Times New Roman"/>
+                <w:b w:val="0"/>
+                <w:bCs w:val="0"/>
+                <w:sz w:val="24"/>
+                <w:szCs w:val="24"/>
+                <w:lang w:val="ru-RU"/>
+              </w:rPr>
+            </w:pPr>
+            <w:r>
+              <w:rPr>
+                <w:rFonts w:hint="default" w:ascii="Times New Roman" w:hAnsi="Times New Roman"/>
+                <w:b w:val="0"/>
+                <w:bCs w:val="0"/>
+                <w:sz w:val="24"/>
+                <w:szCs w:val="24"/>
+                <w:lang w:val="ru-RU" w:eastAsia="zh-CN"/>
+              </w:rPr>
+              <w:t>Организация и запуск тестов</w:t>
+            </w:r>
+          </w:p>
+        </w:tc>
+        <w:tc>
+          <w:tcPr>
+            <w:tcW w:w="0" w:type="auto"/>
+            <w:shd w:val="clear"/>
+            <w:vAlign w:val="center"/>
+          </w:tcPr>
+          <w:p>
+            <w:pPr>
+              <w:numPr>
+                <w:ilvl w:val="0"/>
+                <w:numId w:val="0"/>
+              </w:numPr>
+              <w:spacing w:after="160" w:line="360" w:lineRule="auto"/>
+              <w:jc w:val="center"/>
+              <w:rPr>
+                <w:rFonts w:hint="default" w:ascii="Times New Roman" w:hAnsi="Times New Roman"/>
+                <w:b w:val="0"/>
+                <w:bCs w:val="0"/>
+                <w:sz w:val="24"/>
+                <w:szCs w:val="24"/>
+                <w:lang w:val="ru-RU"/>
+              </w:rPr>
+            </w:pPr>
+            <w:r>
+              <w:rPr>
+                <w:rFonts w:hint="default" w:ascii="Times New Roman" w:hAnsi="Times New Roman"/>
+                <w:b w:val="0"/>
+                <w:bCs w:val="0"/>
+                <w:sz w:val="24"/>
+                <w:szCs w:val="24"/>
+                <w:lang w:val="ru-RU" w:eastAsia="zh-CN"/>
+              </w:rPr>
+              <w:t>Простота интеграции, распространённость</w:t>
+            </w:r>
+          </w:p>
+        </w:tc>
+        <w:tc>
+          <w:tcPr>
+            <w:tcW w:w="0" w:type="auto"/>
+            <w:shd w:val="clear"/>
+            <w:vAlign w:val="center"/>
+          </w:tcPr>
+          <w:p>
+            <w:pPr>
+              <w:numPr>
+                <w:ilvl w:val="0"/>
+                <w:numId w:val="0"/>
+              </w:numPr>
+              <w:spacing w:after="160" w:line="360" w:lineRule="auto"/>
+              <w:jc w:val="center"/>
+              <w:rPr>
+                <w:rFonts w:hint="default" w:ascii="Times New Roman" w:hAnsi="Times New Roman"/>
+                <w:b w:val="0"/>
+                <w:bCs w:val="0"/>
+                <w:sz w:val="24"/>
+                <w:szCs w:val="24"/>
+                <w:lang w:val="ru-RU"/>
+              </w:rPr>
+            </w:pPr>
+            <w:r>
+              <w:rPr>
+                <w:rFonts w:hint="default" w:ascii="Times New Roman" w:hAnsi="Times New Roman"/>
+                <w:b w:val="0"/>
+                <w:bCs w:val="0"/>
+                <w:sz w:val="24"/>
+                <w:szCs w:val="24"/>
+                <w:lang w:val="ru-RU" w:eastAsia="zh-CN"/>
+              </w:rPr>
+              <w:t>Backend-логика, unit-тесты</w:t>
+            </w:r>
+          </w:p>
+        </w:tc>
+      </w:tr>
+      <w:tr>
+        <w:tblPrEx>
+          <w:tblBorders>
+            <w:top w:val="single" w:color="auto" w:sz="4" w:space="0"/>
+            <w:left w:val="single" w:color="auto" w:sz="4" w:space="0"/>
+            <w:bottom w:val="single" w:color="auto" w:sz="4" w:space="0"/>
+            <w:right w:val="single" w:color="auto" w:sz="4" w:space="0"/>
+            <w:insideH w:val="single" w:color="auto" w:sz="4" w:space="0"/>
+            <w:insideV w:val="single" w:color="auto" w:sz="4" w:space="0"/>
+          </w:tblBorders>
+          <w:tblCellMar>
+            <w:top w:w="15" w:type="dxa"/>
+            <w:left w:w="15" w:type="dxa"/>
+            <w:bottom w:w="15" w:type="dxa"/>
+            <w:right w:w="15" w:type="dxa"/>
+          </w:tblCellMar>
+        </w:tblPrEx>
+        <w:trPr>
+          <w:tblCellSpacing w:w="15" w:type="dxa"/>
+          <w:jc w:val="center"/>
+        </w:trPr>
+        <w:tc>
+          <w:tcPr>
+            <w:tcW w:w="0" w:type="auto"/>
+            <w:shd w:val="clear"/>
+            <w:vAlign w:val="center"/>
+          </w:tcPr>
+          <w:p>
+            <w:pPr>
+              <w:numPr>
+                <w:ilvl w:val="0"/>
+                <w:numId w:val="0"/>
+              </w:numPr>
+              <w:spacing w:after="160" w:line="360" w:lineRule="auto"/>
+              <w:jc w:val="center"/>
+              <w:rPr>
+                <w:rFonts w:hint="default" w:ascii="Times New Roman" w:hAnsi="Times New Roman"/>
+                <w:b w:val="0"/>
+                <w:bCs w:val="0"/>
+                <w:sz w:val="24"/>
+                <w:szCs w:val="24"/>
+                <w:lang w:val="ru-RU"/>
+              </w:rPr>
+            </w:pPr>
+            <w:r>
+              <w:rPr>
+                <w:rFonts w:hint="default" w:ascii="Times New Roman" w:hAnsi="Times New Roman"/>
+                <w:b w:val="0"/>
+                <w:bCs w:val="0"/>
+                <w:sz w:val="24"/>
+                <w:szCs w:val="24"/>
+                <w:lang w:val="ru-RU" w:eastAsia="zh-CN"/>
+              </w:rPr>
+              <w:t>TestNG</w:t>
+            </w:r>
+          </w:p>
+        </w:tc>
+        <w:tc>
+          <w:tcPr>
+            <w:tcW w:w="0" w:type="auto"/>
+            <w:shd w:val="clear"/>
+            <w:vAlign w:val="center"/>
+          </w:tcPr>
+          <w:p>
+            <w:pPr>
+              <w:numPr>
+                <w:ilvl w:val="0"/>
+                <w:numId w:val="0"/>
+              </w:numPr>
+              <w:spacing w:after="160" w:line="360" w:lineRule="auto"/>
+              <w:jc w:val="center"/>
+              <w:rPr>
+                <w:rFonts w:hint="default" w:ascii="Times New Roman" w:hAnsi="Times New Roman"/>
+                <w:b w:val="0"/>
+                <w:bCs w:val="0"/>
+                <w:sz w:val="24"/>
+                <w:szCs w:val="24"/>
+                <w:lang w:val="ru-RU"/>
+              </w:rPr>
+            </w:pPr>
+            <w:r>
+              <w:rPr>
+                <w:rFonts w:hint="default" w:ascii="Times New Roman" w:hAnsi="Times New Roman"/>
+                <w:b w:val="0"/>
+                <w:bCs w:val="0"/>
+                <w:sz w:val="24"/>
+                <w:szCs w:val="24"/>
+                <w:lang w:val="ru-RU" w:eastAsia="zh-CN"/>
+              </w:rPr>
+              <w:t>Модульное тестирование</w:t>
+            </w:r>
+          </w:p>
+        </w:tc>
+        <w:tc>
+          <w:tcPr>
+            <w:tcW w:w="0" w:type="auto"/>
+            <w:shd w:val="clear"/>
+            <w:vAlign w:val="center"/>
+          </w:tcPr>
+          <w:p>
+            <w:pPr>
+              <w:numPr>
+                <w:ilvl w:val="0"/>
+                <w:numId w:val="0"/>
+              </w:numPr>
+              <w:spacing w:after="160" w:line="360" w:lineRule="auto"/>
+              <w:jc w:val="center"/>
+              <w:rPr>
+                <w:rFonts w:hint="default" w:ascii="Times New Roman" w:hAnsi="Times New Roman"/>
+                <w:b w:val="0"/>
+                <w:bCs w:val="0"/>
+                <w:sz w:val="24"/>
+                <w:szCs w:val="24"/>
+                <w:lang w:val="ru-RU"/>
+              </w:rPr>
+            </w:pPr>
+            <w:r>
+              <w:rPr>
+                <w:rFonts w:hint="default" w:ascii="Times New Roman" w:hAnsi="Times New Roman"/>
+                <w:b w:val="0"/>
+                <w:bCs w:val="0"/>
+                <w:sz w:val="24"/>
+                <w:szCs w:val="24"/>
+                <w:lang w:val="ru-RU" w:eastAsia="zh-CN"/>
+              </w:rPr>
+              <w:t>Управление тестовыми наборами</w:t>
+            </w:r>
+          </w:p>
+        </w:tc>
+        <w:tc>
+          <w:tcPr>
+            <w:tcW w:w="0" w:type="auto"/>
+            <w:shd w:val="clear"/>
+            <w:vAlign w:val="center"/>
+          </w:tcPr>
+          <w:p>
+            <w:pPr>
+              <w:numPr>
+                <w:ilvl w:val="0"/>
+                <w:numId w:val="0"/>
+              </w:numPr>
+              <w:spacing w:after="160" w:line="360" w:lineRule="auto"/>
+              <w:jc w:val="center"/>
+              <w:rPr>
+                <w:rFonts w:hint="default" w:ascii="Times New Roman" w:hAnsi="Times New Roman"/>
+                <w:b w:val="0"/>
+                <w:bCs w:val="0"/>
+                <w:sz w:val="24"/>
+                <w:szCs w:val="24"/>
+                <w:lang w:val="ru-RU"/>
+              </w:rPr>
+            </w:pPr>
+            <w:r>
+              <w:rPr>
+                <w:rFonts w:hint="default" w:ascii="Times New Roman" w:hAnsi="Times New Roman"/>
+                <w:b w:val="0"/>
+                <w:bCs w:val="0"/>
+                <w:sz w:val="24"/>
+                <w:szCs w:val="24"/>
+                <w:lang w:val="ru-RU" w:eastAsia="zh-CN"/>
+              </w:rPr>
+              <w:t>Гибкая конфигурация, отчётность</w:t>
+            </w:r>
+          </w:p>
+        </w:tc>
+        <w:tc>
+          <w:tcPr>
+            <w:tcW w:w="0" w:type="auto"/>
+            <w:shd w:val="clear"/>
+            <w:vAlign w:val="center"/>
+          </w:tcPr>
+          <w:p>
+            <w:pPr>
+              <w:numPr>
+                <w:ilvl w:val="0"/>
+                <w:numId w:val="0"/>
+              </w:numPr>
+              <w:spacing w:after="160" w:line="360" w:lineRule="auto"/>
+              <w:jc w:val="center"/>
+              <w:rPr>
+                <w:rFonts w:hint="default" w:ascii="Times New Roman" w:hAnsi="Times New Roman"/>
+                <w:b w:val="0"/>
+                <w:bCs w:val="0"/>
+                <w:sz w:val="24"/>
+                <w:szCs w:val="24"/>
+                <w:lang w:val="ru-RU"/>
+              </w:rPr>
+            </w:pPr>
+            <w:r>
+              <w:rPr>
+                <w:rFonts w:hint="default" w:ascii="Times New Roman" w:hAnsi="Times New Roman"/>
+                <w:b w:val="0"/>
+                <w:bCs w:val="0"/>
+                <w:sz w:val="24"/>
+                <w:szCs w:val="24"/>
+                <w:lang w:val="ru-RU" w:eastAsia="zh-CN"/>
+              </w:rPr>
+              <w:t>Комплексные тестовые сценарии</w:t>
+            </w:r>
+          </w:p>
+        </w:tc>
+      </w:tr>
+      <w:tr>
+        <w:tblPrEx>
+          <w:tblBorders>
+            <w:top w:val="single" w:color="auto" w:sz="4" w:space="0"/>
+            <w:left w:val="single" w:color="auto" w:sz="4" w:space="0"/>
+            <w:bottom w:val="single" w:color="auto" w:sz="4" w:space="0"/>
+            <w:right w:val="single" w:color="auto" w:sz="4" w:space="0"/>
+            <w:insideH w:val="single" w:color="auto" w:sz="4" w:space="0"/>
+            <w:insideV w:val="single" w:color="auto" w:sz="4" w:space="0"/>
+          </w:tblBorders>
+          <w:tblCellMar>
+            <w:top w:w="15" w:type="dxa"/>
+            <w:left w:w="15" w:type="dxa"/>
+            <w:bottom w:w="15" w:type="dxa"/>
+            <w:right w:w="15" w:type="dxa"/>
+          </w:tblCellMar>
+        </w:tblPrEx>
+        <w:trPr>
+          <w:tblCellSpacing w:w="15" w:type="dxa"/>
+          <w:jc w:val="center"/>
+        </w:trPr>
+        <w:tc>
+          <w:tcPr>
+            <w:tcW w:w="0" w:type="auto"/>
+            <w:shd w:val="clear"/>
+            <w:vAlign w:val="center"/>
+          </w:tcPr>
+          <w:p>
+            <w:pPr>
+              <w:numPr>
+                <w:ilvl w:val="0"/>
+                <w:numId w:val="0"/>
+              </w:numPr>
+              <w:spacing w:after="160" w:line="360" w:lineRule="auto"/>
+              <w:jc w:val="center"/>
+              <w:rPr>
+                <w:rFonts w:hint="default" w:ascii="Times New Roman" w:hAnsi="Times New Roman"/>
+                <w:b w:val="0"/>
+                <w:bCs w:val="0"/>
+                <w:sz w:val="24"/>
+                <w:szCs w:val="24"/>
+                <w:lang w:val="ru-RU"/>
+              </w:rPr>
+            </w:pPr>
+            <w:r>
+              <w:rPr>
+                <w:rFonts w:hint="default" w:ascii="Times New Roman" w:hAnsi="Times New Roman"/>
+                <w:b w:val="0"/>
+                <w:bCs w:val="0"/>
+                <w:sz w:val="24"/>
+                <w:szCs w:val="24"/>
+                <w:lang w:val="ru-RU" w:eastAsia="zh-CN"/>
+              </w:rPr>
+              <w:t>API-тест инструменты</w:t>
+            </w:r>
+          </w:p>
+        </w:tc>
+        <w:tc>
+          <w:tcPr>
+            <w:tcW w:w="0" w:type="auto"/>
+            <w:shd w:val="clear"/>
+            <w:vAlign w:val="center"/>
+          </w:tcPr>
+          <w:p>
+            <w:pPr>
+              <w:numPr>
+                <w:ilvl w:val="0"/>
+                <w:numId w:val="0"/>
+              </w:numPr>
+              <w:spacing w:after="160" w:line="360" w:lineRule="auto"/>
+              <w:jc w:val="center"/>
+              <w:rPr>
+                <w:rFonts w:hint="default" w:ascii="Times New Roman" w:hAnsi="Times New Roman"/>
+                <w:b w:val="0"/>
+                <w:bCs w:val="0"/>
+                <w:sz w:val="24"/>
+                <w:szCs w:val="24"/>
+                <w:lang w:val="ru-RU"/>
+              </w:rPr>
+            </w:pPr>
+            <w:r>
+              <w:rPr>
+                <w:rFonts w:hint="default" w:ascii="Times New Roman" w:hAnsi="Times New Roman"/>
+                <w:b w:val="0"/>
+                <w:bCs w:val="0"/>
+                <w:sz w:val="24"/>
+                <w:szCs w:val="24"/>
+                <w:lang w:val="ru-RU" w:eastAsia="zh-CN"/>
+              </w:rPr>
+              <w:t>API-тестирование</w:t>
+            </w:r>
+          </w:p>
+        </w:tc>
+        <w:tc>
+          <w:tcPr>
+            <w:tcW w:w="0" w:type="auto"/>
+            <w:shd w:val="clear"/>
+            <w:vAlign w:val="center"/>
+          </w:tcPr>
+          <w:p>
+            <w:pPr>
+              <w:numPr>
+                <w:ilvl w:val="0"/>
+                <w:numId w:val="0"/>
+              </w:numPr>
+              <w:spacing w:after="160" w:line="360" w:lineRule="auto"/>
+              <w:jc w:val="center"/>
+              <w:rPr>
+                <w:rFonts w:hint="default" w:ascii="Times New Roman" w:hAnsi="Times New Roman"/>
+                <w:b w:val="0"/>
+                <w:bCs w:val="0"/>
+                <w:sz w:val="24"/>
+                <w:szCs w:val="24"/>
+                <w:lang w:val="ru-RU"/>
+              </w:rPr>
+            </w:pPr>
+            <w:r>
+              <w:rPr>
+                <w:rFonts w:hint="default" w:ascii="Times New Roman" w:hAnsi="Times New Roman"/>
+                <w:b w:val="0"/>
+                <w:bCs w:val="0"/>
+                <w:sz w:val="24"/>
+                <w:szCs w:val="24"/>
+                <w:lang w:val="ru-RU" w:eastAsia="zh-CN"/>
+              </w:rPr>
+              <w:t>Проверка HTTP-запросов и ответов</w:t>
+            </w:r>
+          </w:p>
+        </w:tc>
+        <w:tc>
+          <w:tcPr>
+            <w:tcW w:w="0" w:type="auto"/>
+            <w:shd w:val="clear"/>
+            <w:vAlign w:val="center"/>
+          </w:tcPr>
+          <w:p>
+            <w:pPr>
+              <w:numPr>
+                <w:ilvl w:val="0"/>
+                <w:numId w:val="0"/>
+              </w:numPr>
+              <w:spacing w:after="160" w:line="360" w:lineRule="auto"/>
+              <w:jc w:val="center"/>
+              <w:rPr>
+                <w:rFonts w:hint="default" w:ascii="Times New Roman" w:hAnsi="Times New Roman"/>
+                <w:b w:val="0"/>
+                <w:bCs w:val="0"/>
+                <w:sz w:val="24"/>
+                <w:szCs w:val="24"/>
+                <w:lang w:val="ru-RU"/>
+              </w:rPr>
+            </w:pPr>
+            <w:r>
+              <w:rPr>
+                <w:rFonts w:hint="default" w:ascii="Times New Roman" w:hAnsi="Times New Roman"/>
+                <w:b w:val="0"/>
+                <w:bCs w:val="0"/>
+                <w:sz w:val="24"/>
+                <w:szCs w:val="24"/>
+                <w:lang w:val="ru-RU" w:eastAsia="zh-CN"/>
+              </w:rPr>
+              <w:t>Быстрое выявление ошибок бизнес-логики</w:t>
+            </w:r>
+          </w:p>
+        </w:tc>
+        <w:tc>
+          <w:tcPr>
+            <w:tcW w:w="0" w:type="auto"/>
+            <w:shd w:val="clear"/>
+            <w:vAlign w:val="center"/>
+          </w:tcPr>
+          <w:p>
+            <w:pPr>
+              <w:numPr>
+                <w:ilvl w:val="0"/>
+                <w:numId w:val="0"/>
+              </w:numPr>
+              <w:spacing w:after="160" w:line="360" w:lineRule="auto"/>
+              <w:jc w:val="center"/>
+              <w:rPr>
+                <w:rFonts w:hint="default" w:ascii="Times New Roman" w:hAnsi="Times New Roman"/>
+                <w:b w:val="0"/>
+                <w:bCs w:val="0"/>
+                <w:sz w:val="24"/>
+                <w:szCs w:val="24"/>
+                <w:lang w:val="ru-RU"/>
+              </w:rPr>
+            </w:pPr>
+            <w:r>
+              <w:rPr>
+                <w:rFonts w:hint="default" w:ascii="Times New Roman" w:hAnsi="Times New Roman"/>
+                <w:b w:val="0"/>
+                <w:bCs w:val="0"/>
+                <w:sz w:val="24"/>
+                <w:szCs w:val="24"/>
+                <w:lang w:val="ru-RU" w:eastAsia="zh-CN"/>
+              </w:rPr>
+              <w:t>Проверка backend без UI</w:t>
+            </w:r>
+          </w:p>
+        </w:tc>
+      </w:tr>
+      <w:tr>
+        <w:tblPrEx>
+          <w:tblBorders>
+            <w:top w:val="single" w:color="auto" w:sz="4" w:space="0"/>
+            <w:left w:val="single" w:color="auto" w:sz="4" w:space="0"/>
+            <w:bottom w:val="single" w:color="auto" w:sz="4" w:space="0"/>
+            <w:right w:val="single" w:color="auto" w:sz="4" w:space="0"/>
+            <w:insideH w:val="single" w:color="auto" w:sz="4" w:space="0"/>
+            <w:insideV w:val="single" w:color="auto" w:sz="4" w:space="0"/>
+          </w:tblBorders>
+          <w:shd w:val="clear"/>
+          <w:tblCellMar>
+            <w:top w:w="15" w:type="dxa"/>
+            <w:left w:w="15" w:type="dxa"/>
+            <w:bottom w:w="15" w:type="dxa"/>
+            <w:right w:w="15" w:type="dxa"/>
+          </w:tblCellMar>
+        </w:tblPrEx>
+        <w:trPr>
+          <w:tblCellSpacing w:w="15" w:type="dxa"/>
+          <w:jc w:val="center"/>
+        </w:trPr>
+        <w:tc>
+          <w:tcPr>
+            <w:tcW w:w="0" w:type="auto"/>
+            <w:shd w:val="clear"/>
+            <w:vAlign w:val="center"/>
+          </w:tcPr>
+          <w:p>
+            <w:pPr>
+              <w:numPr>
+                <w:ilvl w:val="0"/>
+                <w:numId w:val="0"/>
+              </w:numPr>
+              <w:spacing w:after="160" w:line="360" w:lineRule="auto"/>
+              <w:jc w:val="center"/>
+              <w:rPr>
+                <w:rFonts w:hint="default" w:ascii="Times New Roman" w:hAnsi="Times New Roman"/>
+                <w:b w:val="0"/>
+                <w:bCs w:val="0"/>
+                <w:sz w:val="24"/>
+                <w:szCs w:val="24"/>
+                <w:lang w:val="ru-RU"/>
+              </w:rPr>
+            </w:pPr>
+            <w:r>
+              <w:rPr>
+                <w:rFonts w:hint="default" w:ascii="Times New Roman" w:hAnsi="Times New Roman"/>
+                <w:b w:val="0"/>
+                <w:bCs w:val="0"/>
+                <w:sz w:val="24"/>
+                <w:szCs w:val="24"/>
+                <w:lang w:val="ru-RU" w:eastAsia="zh-CN"/>
+              </w:rPr>
+              <w:t>Jenkins</w:t>
+            </w:r>
+          </w:p>
+        </w:tc>
+        <w:tc>
+          <w:tcPr>
+            <w:tcW w:w="0" w:type="auto"/>
+            <w:shd w:val="clear"/>
+            <w:vAlign w:val="center"/>
+          </w:tcPr>
+          <w:p>
+            <w:pPr>
+              <w:numPr>
+                <w:ilvl w:val="0"/>
+                <w:numId w:val="0"/>
+              </w:numPr>
+              <w:spacing w:after="160" w:line="360" w:lineRule="auto"/>
+              <w:jc w:val="center"/>
+              <w:rPr>
+                <w:rFonts w:hint="default" w:ascii="Times New Roman" w:hAnsi="Times New Roman"/>
+                <w:b w:val="0"/>
+                <w:bCs w:val="0"/>
+                <w:sz w:val="24"/>
+                <w:szCs w:val="24"/>
+                <w:lang w:val="ru-RU"/>
+              </w:rPr>
+            </w:pPr>
+            <w:r>
+              <w:rPr>
+                <w:rFonts w:hint="default" w:ascii="Times New Roman" w:hAnsi="Times New Roman"/>
+                <w:b w:val="0"/>
+                <w:bCs w:val="0"/>
+                <w:sz w:val="24"/>
+                <w:szCs w:val="24"/>
+                <w:lang w:val="ru-RU" w:eastAsia="zh-CN"/>
+              </w:rPr>
+              <w:t>CI/CD</w:t>
+            </w:r>
+          </w:p>
+        </w:tc>
+        <w:tc>
+          <w:tcPr>
+            <w:tcW w:w="0" w:type="auto"/>
+            <w:shd w:val="clear"/>
+            <w:vAlign w:val="center"/>
+          </w:tcPr>
+          <w:p>
+            <w:pPr>
+              <w:numPr>
+                <w:ilvl w:val="0"/>
+                <w:numId w:val="0"/>
+              </w:numPr>
+              <w:spacing w:after="160" w:line="360" w:lineRule="auto"/>
+              <w:jc w:val="center"/>
+              <w:rPr>
+                <w:rFonts w:hint="default" w:ascii="Times New Roman" w:hAnsi="Times New Roman"/>
+                <w:b w:val="0"/>
+                <w:bCs w:val="0"/>
+                <w:sz w:val="24"/>
+                <w:szCs w:val="24"/>
+                <w:lang w:val="ru-RU"/>
+              </w:rPr>
+            </w:pPr>
+            <w:r>
+              <w:rPr>
+                <w:rFonts w:hint="default" w:ascii="Times New Roman" w:hAnsi="Times New Roman"/>
+                <w:b w:val="0"/>
+                <w:bCs w:val="0"/>
+                <w:sz w:val="24"/>
+                <w:szCs w:val="24"/>
+                <w:lang w:val="ru-RU" w:eastAsia="zh-CN"/>
+              </w:rPr>
+              <w:t>Автоматизация сборки и запуска тестов</w:t>
+            </w:r>
+          </w:p>
+        </w:tc>
+        <w:tc>
+          <w:tcPr>
+            <w:tcW w:w="0" w:type="auto"/>
+            <w:shd w:val="clear"/>
+            <w:vAlign w:val="center"/>
+          </w:tcPr>
+          <w:p>
+            <w:pPr>
+              <w:numPr>
+                <w:ilvl w:val="0"/>
+                <w:numId w:val="0"/>
+              </w:numPr>
+              <w:spacing w:after="160" w:line="360" w:lineRule="auto"/>
+              <w:jc w:val="center"/>
+              <w:rPr>
+                <w:rFonts w:hint="default" w:ascii="Times New Roman" w:hAnsi="Times New Roman"/>
+                <w:b w:val="0"/>
+                <w:bCs w:val="0"/>
+                <w:sz w:val="24"/>
+                <w:szCs w:val="24"/>
+                <w:lang w:val="ru-RU"/>
+              </w:rPr>
+            </w:pPr>
+            <w:r>
+              <w:rPr>
+                <w:rFonts w:hint="default" w:ascii="Times New Roman" w:hAnsi="Times New Roman"/>
+                <w:b w:val="0"/>
+                <w:bCs w:val="0"/>
+                <w:sz w:val="24"/>
+                <w:szCs w:val="24"/>
+                <w:lang w:val="ru-RU" w:eastAsia="zh-CN"/>
+              </w:rPr>
+              <w:t>Автоматизация процессов разработки</w:t>
+            </w:r>
+          </w:p>
+        </w:tc>
+        <w:tc>
+          <w:tcPr>
+            <w:tcW w:w="0" w:type="auto"/>
+            <w:shd w:val="clear"/>
+            <w:vAlign w:val="center"/>
+          </w:tcPr>
+          <w:p>
+            <w:pPr>
+              <w:numPr>
+                <w:ilvl w:val="0"/>
+                <w:numId w:val="0"/>
+              </w:numPr>
+              <w:spacing w:after="160" w:line="360" w:lineRule="auto"/>
+              <w:jc w:val="center"/>
+              <w:rPr>
+                <w:rFonts w:hint="default" w:ascii="Times New Roman" w:hAnsi="Times New Roman"/>
+                <w:b w:val="0"/>
+                <w:bCs w:val="0"/>
+                <w:sz w:val="24"/>
+                <w:szCs w:val="24"/>
+                <w:lang w:val="ru-RU"/>
+              </w:rPr>
+            </w:pPr>
+            <w:r>
+              <w:rPr>
+                <w:rFonts w:hint="default" w:ascii="Times New Roman" w:hAnsi="Times New Roman"/>
+                <w:b w:val="0"/>
+                <w:bCs w:val="0"/>
+                <w:sz w:val="24"/>
+                <w:szCs w:val="24"/>
+                <w:lang w:val="ru-RU" w:eastAsia="zh-CN"/>
+              </w:rPr>
+              <w:t>Непрерывная интеграция</w:t>
+            </w:r>
+          </w:p>
+        </w:tc>
+      </w:tr>
+      <w:tr>
+        <w:tblPrEx>
+          <w:tblBorders>
+            <w:top w:val="single" w:color="auto" w:sz="4" w:space="0"/>
+            <w:left w:val="single" w:color="auto" w:sz="4" w:space="0"/>
+            <w:bottom w:val="single" w:color="auto" w:sz="4" w:space="0"/>
+            <w:right w:val="single" w:color="auto" w:sz="4" w:space="0"/>
+            <w:insideH w:val="single" w:color="auto" w:sz="4" w:space="0"/>
+            <w:insideV w:val="single" w:color="auto" w:sz="4" w:space="0"/>
+          </w:tblBorders>
+          <w:tblCellMar>
+            <w:top w:w="15" w:type="dxa"/>
+            <w:left w:w="15" w:type="dxa"/>
+            <w:bottom w:w="15" w:type="dxa"/>
+            <w:right w:w="15" w:type="dxa"/>
+          </w:tblCellMar>
+        </w:tblPrEx>
+        <w:trPr>
+          <w:tblCellSpacing w:w="15" w:type="dxa"/>
+          <w:jc w:val="center"/>
+        </w:trPr>
+        <w:tc>
+          <w:tcPr>
+            <w:tcW w:w="0" w:type="auto"/>
+            <w:shd w:val="clear"/>
+            <w:vAlign w:val="center"/>
+          </w:tcPr>
+          <w:p>
+            <w:pPr>
+              <w:numPr>
+                <w:ilvl w:val="0"/>
+                <w:numId w:val="0"/>
+              </w:numPr>
+              <w:spacing w:after="160" w:line="360" w:lineRule="auto"/>
+              <w:jc w:val="center"/>
+              <w:rPr>
+                <w:rFonts w:hint="default" w:ascii="Times New Roman" w:hAnsi="Times New Roman"/>
+                <w:b w:val="0"/>
+                <w:bCs w:val="0"/>
+                <w:sz w:val="24"/>
+                <w:szCs w:val="24"/>
+                <w:lang w:val="ru-RU"/>
+              </w:rPr>
+            </w:pPr>
+            <w:r>
+              <w:rPr>
+                <w:rFonts w:hint="default" w:ascii="Times New Roman" w:hAnsi="Times New Roman"/>
+                <w:b w:val="0"/>
+                <w:bCs w:val="0"/>
+                <w:sz w:val="24"/>
+                <w:szCs w:val="24"/>
+                <w:lang w:val="ru-RU" w:eastAsia="zh-CN"/>
+              </w:rPr>
+              <w:t>Allure Report</w:t>
+            </w:r>
+          </w:p>
+        </w:tc>
+        <w:tc>
+          <w:tcPr>
+            <w:tcW w:w="0" w:type="auto"/>
+            <w:shd w:val="clear"/>
+            <w:vAlign w:val="center"/>
+          </w:tcPr>
+          <w:p>
+            <w:pPr>
+              <w:numPr>
+                <w:ilvl w:val="0"/>
+                <w:numId w:val="0"/>
+              </w:numPr>
+              <w:spacing w:after="160" w:line="360" w:lineRule="auto"/>
+              <w:jc w:val="center"/>
+              <w:rPr>
+                <w:rFonts w:hint="default" w:ascii="Times New Roman" w:hAnsi="Times New Roman"/>
+                <w:b w:val="0"/>
+                <w:bCs w:val="0"/>
+                <w:sz w:val="24"/>
+                <w:szCs w:val="24"/>
+                <w:lang w:val="ru-RU"/>
+              </w:rPr>
+            </w:pPr>
+            <w:r>
+              <w:rPr>
+                <w:rFonts w:hint="default" w:ascii="Times New Roman" w:hAnsi="Times New Roman"/>
+                <w:b w:val="0"/>
+                <w:bCs w:val="0"/>
+                <w:sz w:val="24"/>
+                <w:szCs w:val="24"/>
+                <w:lang w:val="ru-RU" w:eastAsia="zh-CN"/>
+              </w:rPr>
+              <w:t>Отчётность</w:t>
+            </w:r>
+          </w:p>
+        </w:tc>
+        <w:tc>
+          <w:tcPr>
+            <w:tcW w:w="0" w:type="auto"/>
+            <w:shd w:val="clear"/>
+            <w:vAlign w:val="center"/>
+          </w:tcPr>
+          <w:p>
+            <w:pPr>
+              <w:numPr>
+                <w:ilvl w:val="0"/>
+                <w:numId w:val="0"/>
+              </w:numPr>
+              <w:spacing w:after="160" w:line="360" w:lineRule="auto"/>
+              <w:jc w:val="center"/>
+              <w:rPr>
+                <w:rFonts w:hint="default" w:ascii="Times New Roman" w:hAnsi="Times New Roman"/>
+                <w:b w:val="0"/>
+                <w:bCs w:val="0"/>
+                <w:sz w:val="24"/>
+                <w:szCs w:val="24"/>
+                <w:lang w:val="ru-RU"/>
+              </w:rPr>
+            </w:pPr>
+            <w:r>
+              <w:rPr>
+                <w:rFonts w:hint="default" w:ascii="Times New Roman" w:hAnsi="Times New Roman"/>
+                <w:b w:val="0"/>
+                <w:bCs w:val="0"/>
+                <w:sz w:val="24"/>
+                <w:szCs w:val="24"/>
+                <w:lang w:val="ru-RU" w:eastAsia="zh-CN"/>
+              </w:rPr>
+              <w:t>Анализ результатов тестирования</w:t>
+            </w:r>
+          </w:p>
+        </w:tc>
+        <w:tc>
+          <w:tcPr>
+            <w:tcW w:w="0" w:type="auto"/>
+            <w:shd w:val="clear"/>
+            <w:vAlign w:val="center"/>
+          </w:tcPr>
+          <w:p>
+            <w:pPr>
+              <w:numPr>
+                <w:ilvl w:val="0"/>
+                <w:numId w:val="0"/>
+              </w:numPr>
+              <w:spacing w:after="160" w:line="360" w:lineRule="auto"/>
+              <w:jc w:val="center"/>
+              <w:rPr>
+                <w:rFonts w:hint="default" w:ascii="Times New Roman" w:hAnsi="Times New Roman"/>
+                <w:b w:val="0"/>
+                <w:bCs w:val="0"/>
+                <w:sz w:val="24"/>
+                <w:szCs w:val="24"/>
+                <w:lang w:val="ru-RU"/>
+              </w:rPr>
+            </w:pPr>
+            <w:r>
+              <w:rPr>
+                <w:rFonts w:hint="default" w:ascii="Times New Roman" w:hAnsi="Times New Roman"/>
+                <w:b w:val="0"/>
+                <w:bCs w:val="0"/>
+                <w:sz w:val="24"/>
+                <w:szCs w:val="24"/>
+                <w:lang w:val="ru-RU" w:eastAsia="zh-CN"/>
+              </w:rPr>
+              <w:t>Наглядные отчёты, история запусков</w:t>
+            </w:r>
+          </w:p>
+        </w:tc>
+        <w:tc>
+          <w:tcPr>
+            <w:tcW w:w="0" w:type="auto"/>
+            <w:shd w:val="clear"/>
+            <w:vAlign w:val="center"/>
+          </w:tcPr>
+          <w:p>
+            <w:pPr>
+              <w:numPr>
+                <w:ilvl w:val="0"/>
+                <w:numId w:val="0"/>
+              </w:numPr>
+              <w:spacing w:after="160" w:line="360" w:lineRule="auto"/>
+              <w:jc w:val="center"/>
+              <w:rPr>
+                <w:rFonts w:hint="default" w:ascii="Times New Roman" w:hAnsi="Times New Roman"/>
+                <w:b w:val="0"/>
+                <w:bCs w:val="0"/>
+                <w:sz w:val="24"/>
+                <w:szCs w:val="24"/>
+                <w:lang w:val="ru-RU"/>
+              </w:rPr>
+            </w:pPr>
+            <w:r>
+              <w:rPr>
+                <w:rFonts w:hint="default" w:ascii="Times New Roman" w:hAnsi="Times New Roman"/>
+                <w:b w:val="0"/>
+                <w:bCs w:val="0"/>
+                <w:sz w:val="24"/>
+                <w:szCs w:val="24"/>
+                <w:lang w:val="ru-RU" w:eastAsia="zh-CN"/>
+              </w:rPr>
+              <w:t>Анализ качества ПО</w:t>
+            </w:r>
+          </w:p>
+        </w:tc>
+      </w:tr>
+    </w:tbl>
     <w:p>
       <w:pPr>
         <w:numPr>
@@ -4679,7 +7684,6 @@
           <w:numId w:val="0"/>
         </w:numPr>
         <w:spacing w:after="160" w:line="360" w:lineRule="auto"/>
-        <w:ind w:firstLine="708" w:firstLineChars="0"/>
         <w:jc w:val="both"/>
         <w:rPr>
           <w:rFonts w:hint="default" w:ascii="Times New Roman" w:hAnsi="Times New Roman"/>
@@ -4702,6 +7706,55 @@
         <w:jc w:val="both"/>
         <w:rPr>
           <w:rFonts w:hint="default" w:ascii="Times New Roman" w:hAnsi="Times New Roman"/>
+          <w:b w:val="0"/>
+          <w:bCs w:val="0"/>
+          <w:sz w:val="28"/>
+          <w:szCs w:val="28"/>
+          <w:lang w:val="ru-RU"/>
+        </w:rPr>
+      </w:pPr>
+      <w:r>
+        <w:rPr>
+          <w:rFonts w:hint="default" w:ascii="Times New Roman" w:hAnsi="Times New Roman"/>
+          <w:b w:val="0"/>
+          <w:bCs w:val="0"/>
+          <w:sz w:val="28"/>
+          <w:szCs w:val="28"/>
+          <w:lang w:val="ru-RU"/>
+        </w:rPr>
+        <w:t>Таким образом, использование современных средств автоматизированного тестирования позволяет выстроить эффективную и масштабируемую систему контроля качества веб-приложений, интегрированную в процесс разработки и сопровождения программного обеспечения.</w:t>
+      </w:r>
+    </w:p>
+    <w:p>
+      <w:pPr>
+        <w:numPr>
+          <w:ilvl w:val="0"/>
+          <w:numId w:val="0"/>
+        </w:numPr>
+        <w:spacing w:after="160" w:line="360" w:lineRule="auto"/>
+        <w:ind w:firstLine="708" w:firstLineChars="0"/>
+        <w:jc w:val="both"/>
+        <w:rPr>
+          <w:rFonts w:hint="default" w:ascii="Times New Roman" w:hAnsi="Times New Roman"/>
+          <w:b w:val="0"/>
+          <w:bCs w:val="0"/>
+          <w:sz w:val="28"/>
+          <w:szCs w:val="28"/>
+          <w:lang w:val="ru-RU"/>
+        </w:rPr>
+      </w:pPr>
+    </w:p>
+    <w:p>
+      <w:pPr>
+        <w:numPr>
+          <w:ilvl w:val="0"/>
+          <w:numId w:val="0"/>
+        </w:numPr>
+        <w:spacing w:after="160" w:line="360" w:lineRule="auto"/>
+        <w:ind w:firstLine="708" w:firstLineChars="0"/>
+        <w:jc w:val="both"/>
+        <w:rPr>
+          <w:rFonts w:hint="default" w:ascii="Times New Roman" w:hAnsi="Times New Roman"/>
           <w:b/>
           <w:bCs/>
           <w:sz w:val="28"/>
@@ -5251,6 +8304,808 @@
         </w:rPr>
         <w:t>Дополнительным критерием выбора является возможность параллельного запуска тестов. Поддержка параллельного выполнения позволяет существенно сократить общее время тестирования, особенно при большом объёме тестовых сценариев. Это особенно актуально при интеграции автотестов в CI/CD-процессы, где скорость получения результатов играет важную роль.</w:t>
       </w:r>
+    </w:p>
+    <w:p>
+      <w:pPr>
+        <w:numPr>
+          <w:ilvl w:val="0"/>
+          <w:numId w:val="0"/>
+        </w:numPr>
+        <w:wordWrap w:val="0"/>
+        <w:spacing w:after="160" w:line="360" w:lineRule="auto"/>
+        <w:ind w:firstLine="708" w:firstLineChars="0"/>
+        <w:jc w:val="right"/>
+        <w:rPr>
+          <w:rFonts w:hint="default" w:ascii="Times New Roman" w:hAnsi="Times New Roman"/>
+          <w:b w:val="0"/>
+          <w:bCs w:val="0"/>
+          <w:sz w:val="28"/>
+          <w:szCs w:val="28"/>
+          <w:lang w:val="ru-RU"/>
+        </w:rPr>
+      </w:pPr>
+      <w:r>
+        <w:rPr>
+          <w:rFonts w:hint="default" w:ascii="Times New Roman" w:hAnsi="Times New Roman"/>
+          <w:b w:val="0"/>
+          <w:bCs w:val="0"/>
+          <w:sz w:val="28"/>
+          <w:szCs w:val="28"/>
+          <w:lang w:val="ru-RU"/>
+        </w:rPr>
+        <w:t>Таблица 1.3.1. Критерии выбора инструментов автоматизации тестирования.</w:t>
+      </w:r>
+      <w:bookmarkStart w:id="0" w:name="_GoBack"/>
+      <w:bookmarkEnd w:id="0"/>
+    </w:p>
+    <w:tbl>
+      <w:tblPr>
+        <w:tblW w:w="0" w:type="auto"/>
+        <w:jc w:val="center"/>
+        <w:tblCellSpacing w:w="15" w:type="dxa"/>
+        <w:tblBorders>
+          <w:top w:val="single" w:color="auto" w:sz="4" w:space="0"/>
+          <w:left w:val="single" w:color="auto" w:sz="4" w:space="0"/>
+          <w:bottom w:val="single" w:color="auto" w:sz="4" w:space="0"/>
+          <w:right w:val="single" w:color="auto" w:sz="4" w:space="0"/>
+          <w:insideH w:val="single" w:color="auto" w:sz="4" w:space="0"/>
+          <w:insideV w:val="single" w:color="auto" w:sz="4" w:space="0"/>
+        </w:tblBorders>
+        <w:shd w:val="clear"/>
+        <w:tblLayout w:type="autofit"/>
+        <w:tblCellMar>
+          <w:top w:w="15" w:type="dxa"/>
+          <w:left w:w="15" w:type="dxa"/>
+          <w:bottom w:w="15" w:type="dxa"/>
+          <w:right w:w="15" w:type="dxa"/>
+        </w:tblCellMar>
+      </w:tblPr>
+      <w:tblGrid>
+        <w:gridCol w:w="2428"/>
+        <w:gridCol w:w="3817"/>
+        <w:gridCol w:w="3220"/>
+      </w:tblGrid>
+      <w:tr>
+        <w:tblPrEx>
+          <w:tblBorders>
+            <w:top w:val="single" w:color="auto" w:sz="4" w:space="0"/>
+            <w:left w:val="single" w:color="auto" w:sz="4" w:space="0"/>
+            <w:bottom w:val="single" w:color="auto" w:sz="4" w:space="0"/>
+            <w:right w:val="single" w:color="auto" w:sz="4" w:space="0"/>
+            <w:insideH w:val="single" w:color="auto" w:sz="4" w:space="0"/>
+            <w:insideV w:val="single" w:color="auto" w:sz="4" w:space="0"/>
+          </w:tblBorders>
+          <w:shd w:val="clear"/>
+          <w:tblCellMar>
+            <w:top w:w="15" w:type="dxa"/>
+            <w:left w:w="15" w:type="dxa"/>
+            <w:bottom w:w="15" w:type="dxa"/>
+            <w:right w:w="15" w:type="dxa"/>
+          </w:tblCellMar>
+        </w:tblPrEx>
+        <w:trPr>
+          <w:tblHeader/>
+          <w:tblCellSpacing w:w="15" w:type="dxa"/>
+          <w:jc w:val="center"/>
+        </w:trPr>
+        <w:tc>
+          <w:tcPr>
+            <w:tcW w:w="0" w:type="auto"/>
+            <w:shd w:val="clear"/>
+            <w:vAlign w:val="center"/>
+          </w:tcPr>
+          <w:p>
+            <w:pPr>
+              <w:keepNext w:val="0"/>
+              <w:keepLines w:val="0"/>
+              <w:widowControl/>
+              <w:suppressLineNumbers w:val="0"/>
+              <w:spacing w:line="360" w:lineRule="auto"/>
+              <w:jc w:val="center"/>
+              <w:rPr>
+                <w:rFonts w:hint="default" w:ascii="Times New Roman" w:hAnsi="Times New Roman" w:cs="Times New Roman"/>
+                <w:b/>
+                <w:bCs/>
+                <w:sz w:val="28"/>
+                <w:szCs w:val="28"/>
+              </w:rPr>
+            </w:pPr>
+            <w:r>
+              <w:rPr>
+                <w:rFonts w:hint="default" w:ascii="Times New Roman" w:hAnsi="Times New Roman" w:eastAsia="SimSun" w:cs="Times New Roman"/>
+                <w:b/>
+                <w:bCs/>
+                <w:kern w:val="0"/>
+                <w:sz w:val="28"/>
+                <w:szCs w:val="28"/>
+                <w:lang w:val="en-US" w:eastAsia="zh-CN" w:bidi="ar"/>
+              </w:rPr>
+              <w:t>Критерий</w:t>
+            </w:r>
+          </w:p>
+        </w:tc>
+        <w:tc>
+          <w:tcPr>
+            <w:tcW w:w="0" w:type="auto"/>
+            <w:shd w:val="clear"/>
+            <w:vAlign w:val="center"/>
+          </w:tcPr>
+          <w:p>
+            <w:pPr>
+              <w:keepNext w:val="0"/>
+              <w:keepLines w:val="0"/>
+              <w:widowControl/>
+              <w:suppressLineNumbers w:val="0"/>
+              <w:spacing w:line="360" w:lineRule="auto"/>
+              <w:jc w:val="center"/>
+              <w:rPr>
+                <w:rFonts w:hint="default" w:ascii="Times New Roman" w:hAnsi="Times New Roman" w:cs="Times New Roman"/>
+                <w:b/>
+                <w:bCs/>
+                <w:sz w:val="28"/>
+                <w:szCs w:val="28"/>
+              </w:rPr>
+            </w:pPr>
+            <w:r>
+              <w:rPr>
+                <w:rFonts w:hint="default" w:ascii="Times New Roman" w:hAnsi="Times New Roman" w:eastAsia="SimSun" w:cs="Times New Roman"/>
+                <w:b/>
+                <w:bCs/>
+                <w:kern w:val="0"/>
+                <w:sz w:val="28"/>
+                <w:szCs w:val="28"/>
+                <w:lang w:val="en-US" w:eastAsia="zh-CN" w:bidi="ar"/>
+              </w:rPr>
+              <w:t>Содержание критерия</w:t>
+            </w:r>
+          </w:p>
+        </w:tc>
+        <w:tc>
+          <w:tcPr>
+            <w:tcW w:w="0" w:type="auto"/>
+            <w:shd w:val="clear"/>
+            <w:vAlign w:val="center"/>
+          </w:tcPr>
+          <w:p>
+            <w:pPr>
+              <w:keepNext w:val="0"/>
+              <w:keepLines w:val="0"/>
+              <w:widowControl/>
+              <w:suppressLineNumbers w:val="0"/>
+              <w:spacing w:line="360" w:lineRule="auto"/>
+              <w:jc w:val="center"/>
+              <w:rPr>
+                <w:rFonts w:hint="default" w:ascii="Times New Roman" w:hAnsi="Times New Roman" w:cs="Times New Roman"/>
+                <w:b/>
+                <w:bCs/>
+                <w:sz w:val="28"/>
+                <w:szCs w:val="28"/>
+              </w:rPr>
+            </w:pPr>
+            <w:r>
+              <w:rPr>
+                <w:rFonts w:hint="default" w:ascii="Times New Roman" w:hAnsi="Times New Roman" w:eastAsia="SimSun" w:cs="Times New Roman"/>
+                <w:b/>
+                <w:bCs/>
+                <w:kern w:val="0"/>
+                <w:sz w:val="28"/>
+                <w:szCs w:val="28"/>
+                <w:lang w:val="en-US" w:eastAsia="zh-CN" w:bidi="ar"/>
+              </w:rPr>
+              <w:t>Практическое значение</w:t>
+            </w:r>
+          </w:p>
+        </w:tc>
+      </w:tr>
+      <w:tr>
+        <w:tblPrEx>
+          <w:tblBorders>
+            <w:top w:val="single" w:color="auto" w:sz="4" w:space="0"/>
+            <w:left w:val="single" w:color="auto" w:sz="4" w:space="0"/>
+            <w:bottom w:val="single" w:color="auto" w:sz="4" w:space="0"/>
+            <w:right w:val="single" w:color="auto" w:sz="4" w:space="0"/>
+            <w:insideH w:val="single" w:color="auto" w:sz="4" w:space="0"/>
+            <w:insideV w:val="single" w:color="auto" w:sz="4" w:space="0"/>
+          </w:tblBorders>
+          <w:shd w:val="clear"/>
+          <w:tblCellMar>
+            <w:top w:w="15" w:type="dxa"/>
+            <w:left w:w="15" w:type="dxa"/>
+            <w:bottom w:w="15" w:type="dxa"/>
+            <w:right w:w="15" w:type="dxa"/>
+          </w:tblCellMar>
+        </w:tblPrEx>
+        <w:trPr>
+          <w:tblCellSpacing w:w="15" w:type="dxa"/>
+          <w:jc w:val="center"/>
+        </w:trPr>
+        <w:tc>
+          <w:tcPr>
+            <w:tcW w:w="0" w:type="auto"/>
+            <w:shd w:val="clear"/>
+            <w:vAlign w:val="center"/>
+          </w:tcPr>
+          <w:p>
+            <w:pPr>
+              <w:keepNext w:val="0"/>
+              <w:keepLines w:val="0"/>
+              <w:widowControl/>
+              <w:suppressLineNumbers w:val="0"/>
+              <w:spacing w:line="360" w:lineRule="auto"/>
+              <w:jc w:val="left"/>
+              <w:rPr>
+                <w:rFonts w:hint="default" w:ascii="Times New Roman" w:hAnsi="Times New Roman" w:cs="Times New Roman"/>
+                <w:sz w:val="24"/>
+                <w:szCs w:val="24"/>
+              </w:rPr>
+            </w:pPr>
+            <w:r>
+              <w:rPr>
+                <w:rFonts w:hint="default" w:ascii="Times New Roman" w:hAnsi="Times New Roman" w:eastAsia="SimSun" w:cs="Times New Roman"/>
+                <w:kern w:val="0"/>
+                <w:sz w:val="24"/>
+                <w:szCs w:val="24"/>
+                <w:lang w:val="en-US" w:eastAsia="zh-CN" w:bidi="ar"/>
+              </w:rPr>
+              <w:t>Язык программирования</w:t>
+            </w:r>
+          </w:p>
+        </w:tc>
+        <w:tc>
+          <w:tcPr>
+            <w:tcW w:w="0" w:type="auto"/>
+            <w:shd w:val="clear"/>
+            <w:vAlign w:val="center"/>
+          </w:tcPr>
+          <w:p>
+            <w:pPr>
+              <w:keepNext w:val="0"/>
+              <w:keepLines w:val="0"/>
+              <w:widowControl/>
+              <w:suppressLineNumbers w:val="0"/>
+              <w:spacing w:line="360" w:lineRule="auto"/>
+              <w:jc w:val="left"/>
+              <w:rPr>
+                <w:rFonts w:hint="default" w:ascii="Times New Roman" w:hAnsi="Times New Roman" w:cs="Times New Roman"/>
+                <w:sz w:val="24"/>
+                <w:szCs w:val="24"/>
+              </w:rPr>
+            </w:pPr>
+            <w:r>
+              <w:rPr>
+                <w:rFonts w:hint="default" w:ascii="Times New Roman" w:hAnsi="Times New Roman" w:eastAsia="SimSun" w:cs="Times New Roman"/>
+                <w:kern w:val="0"/>
+                <w:sz w:val="24"/>
+                <w:szCs w:val="24"/>
+                <w:lang w:val="en-US" w:eastAsia="zh-CN" w:bidi="ar"/>
+              </w:rPr>
+              <w:t>Соответствие используемого инструмента языку разработки проекта</w:t>
+            </w:r>
+          </w:p>
+        </w:tc>
+        <w:tc>
+          <w:tcPr>
+            <w:tcW w:w="0" w:type="auto"/>
+            <w:shd w:val="clear"/>
+            <w:vAlign w:val="center"/>
+          </w:tcPr>
+          <w:p>
+            <w:pPr>
+              <w:keepNext w:val="0"/>
+              <w:keepLines w:val="0"/>
+              <w:widowControl/>
+              <w:suppressLineNumbers w:val="0"/>
+              <w:spacing w:line="360" w:lineRule="auto"/>
+              <w:jc w:val="left"/>
+              <w:rPr>
+                <w:rFonts w:hint="default" w:ascii="Times New Roman" w:hAnsi="Times New Roman" w:cs="Times New Roman"/>
+                <w:sz w:val="24"/>
+                <w:szCs w:val="24"/>
+              </w:rPr>
+            </w:pPr>
+            <w:r>
+              <w:rPr>
+                <w:rFonts w:hint="default" w:ascii="Times New Roman" w:hAnsi="Times New Roman" w:eastAsia="SimSun" w:cs="Times New Roman"/>
+                <w:kern w:val="0"/>
+                <w:sz w:val="24"/>
+                <w:szCs w:val="24"/>
+                <w:lang w:val="en-US" w:eastAsia="zh-CN" w:bidi="ar"/>
+              </w:rPr>
+              <w:t>Упрощение поддержки тестового кода, снижение порога входа</w:t>
+            </w:r>
+          </w:p>
+        </w:tc>
+      </w:tr>
+      <w:tr>
+        <w:tblPrEx>
+          <w:tblBorders>
+            <w:top w:val="single" w:color="auto" w:sz="4" w:space="0"/>
+            <w:left w:val="single" w:color="auto" w:sz="4" w:space="0"/>
+            <w:bottom w:val="single" w:color="auto" w:sz="4" w:space="0"/>
+            <w:right w:val="single" w:color="auto" w:sz="4" w:space="0"/>
+            <w:insideH w:val="single" w:color="auto" w:sz="4" w:space="0"/>
+            <w:insideV w:val="single" w:color="auto" w:sz="4" w:space="0"/>
+          </w:tblBorders>
+          <w:tblCellMar>
+            <w:top w:w="15" w:type="dxa"/>
+            <w:left w:w="15" w:type="dxa"/>
+            <w:bottom w:w="15" w:type="dxa"/>
+            <w:right w:w="15" w:type="dxa"/>
+          </w:tblCellMar>
+        </w:tblPrEx>
+        <w:trPr>
+          <w:tblCellSpacing w:w="15" w:type="dxa"/>
+          <w:jc w:val="center"/>
+        </w:trPr>
+        <w:tc>
+          <w:tcPr>
+            <w:tcW w:w="0" w:type="auto"/>
+            <w:shd w:val="clear"/>
+            <w:vAlign w:val="center"/>
+          </w:tcPr>
+          <w:p>
+            <w:pPr>
+              <w:keepNext w:val="0"/>
+              <w:keepLines w:val="0"/>
+              <w:widowControl/>
+              <w:suppressLineNumbers w:val="0"/>
+              <w:spacing w:line="360" w:lineRule="auto"/>
+              <w:jc w:val="left"/>
+              <w:rPr>
+                <w:rFonts w:hint="default" w:ascii="Times New Roman" w:hAnsi="Times New Roman" w:cs="Times New Roman"/>
+                <w:sz w:val="24"/>
+                <w:szCs w:val="24"/>
+              </w:rPr>
+            </w:pPr>
+            <w:r>
+              <w:rPr>
+                <w:rFonts w:hint="default" w:ascii="Times New Roman" w:hAnsi="Times New Roman" w:eastAsia="SimSun" w:cs="Times New Roman"/>
+                <w:kern w:val="0"/>
+                <w:sz w:val="24"/>
+                <w:szCs w:val="24"/>
+                <w:lang w:val="en-US" w:eastAsia="zh-CN" w:bidi="ar"/>
+              </w:rPr>
+              <w:t>Масштабируемость</w:t>
+            </w:r>
+          </w:p>
+        </w:tc>
+        <w:tc>
+          <w:tcPr>
+            <w:tcW w:w="0" w:type="auto"/>
+            <w:shd w:val="clear"/>
+            <w:vAlign w:val="center"/>
+          </w:tcPr>
+          <w:p>
+            <w:pPr>
+              <w:keepNext w:val="0"/>
+              <w:keepLines w:val="0"/>
+              <w:widowControl/>
+              <w:suppressLineNumbers w:val="0"/>
+              <w:spacing w:line="360" w:lineRule="auto"/>
+              <w:jc w:val="left"/>
+              <w:rPr>
+                <w:rFonts w:hint="default" w:ascii="Times New Roman" w:hAnsi="Times New Roman" w:cs="Times New Roman"/>
+                <w:sz w:val="24"/>
+                <w:szCs w:val="24"/>
+              </w:rPr>
+            </w:pPr>
+            <w:r>
+              <w:rPr>
+                <w:rFonts w:hint="default" w:ascii="Times New Roman" w:hAnsi="Times New Roman" w:eastAsia="SimSun" w:cs="Times New Roman"/>
+                <w:kern w:val="0"/>
+                <w:sz w:val="24"/>
+                <w:szCs w:val="24"/>
+                <w:lang w:val="en-US" w:eastAsia="zh-CN" w:bidi="ar"/>
+              </w:rPr>
+              <w:t>Возможность расширения тестовой инфраструктуры и добавления новых тестов</w:t>
+            </w:r>
+          </w:p>
+        </w:tc>
+        <w:tc>
+          <w:tcPr>
+            <w:tcW w:w="0" w:type="auto"/>
+            <w:shd w:val="clear"/>
+            <w:vAlign w:val="center"/>
+          </w:tcPr>
+          <w:p>
+            <w:pPr>
+              <w:keepNext w:val="0"/>
+              <w:keepLines w:val="0"/>
+              <w:widowControl/>
+              <w:suppressLineNumbers w:val="0"/>
+              <w:spacing w:line="360" w:lineRule="auto"/>
+              <w:jc w:val="left"/>
+              <w:rPr>
+                <w:rFonts w:hint="default" w:ascii="Times New Roman" w:hAnsi="Times New Roman" w:cs="Times New Roman"/>
+                <w:sz w:val="24"/>
+                <w:szCs w:val="24"/>
+              </w:rPr>
+            </w:pPr>
+            <w:r>
+              <w:rPr>
+                <w:rFonts w:hint="default" w:ascii="Times New Roman" w:hAnsi="Times New Roman" w:eastAsia="SimSun" w:cs="Times New Roman"/>
+                <w:kern w:val="0"/>
+                <w:sz w:val="24"/>
+                <w:szCs w:val="24"/>
+                <w:lang w:val="en-US" w:eastAsia="zh-CN" w:bidi="ar"/>
+              </w:rPr>
+              <w:t>Обеспечение роста системы тестирования вместе с проектом</w:t>
+            </w:r>
+          </w:p>
+        </w:tc>
+      </w:tr>
+      <w:tr>
+        <w:tblPrEx>
+          <w:tblBorders>
+            <w:top w:val="single" w:color="auto" w:sz="4" w:space="0"/>
+            <w:left w:val="single" w:color="auto" w:sz="4" w:space="0"/>
+            <w:bottom w:val="single" w:color="auto" w:sz="4" w:space="0"/>
+            <w:right w:val="single" w:color="auto" w:sz="4" w:space="0"/>
+            <w:insideH w:val="single" w:color="auto" w:sz="4" w:space="0"/>
+            <w:insideV w:val="single" w:color="auto" w:sz="4" w:space="0"/>
+          </w:tblBorders>
+          <w:tblCellMar>
+            <w:top w:w="15" w:type="dxa"/>
+            <w:left w:w="15" w:type="dxa"/>
+            <w:bottom w:w="15" w:type="dxa"/>
+            <w:right w:w="15" w:type="dxa"/>
+          </w:tblCellMar>
+        </w:tblPrEx>
+        <w:trPr>
+          <w:tblCellSpacing w:w="15" w:type="dxa"/>
+          <w:jc w:val="center"/>
+        </w:trPr>
+        <w:tc>
+          <w:tcPr>
+            <w:tcW w:w="0" w:type="auto"/>
+            <w:shd w:val="clear"/>
+            <w:vAlign w:val="center"/>
+          </w:tcPr>
+          <w:p>
+            <w:pPr>
+              <w:keepNext w:val="0"/>
+              <w:keepLines w:val="0"/>
+              <w:widowControl/>
+              <w:suppressLineNumbers w:val="0"/>
+              <w:spacing w:line="360" w:lineRule="auto"/>
+              <w:jc w:val="left"/>
+              <w:rPr>
+                <w:rFonts w:hint="default" w:ascii="Times New Roman" w:hAnsi="Times New Roman" w:cs="Times New Roman"/>
+                <w:sz w:val="24"/>
+                <w:szCs w:val="24"/>
+              </w:rPr>
+            </w:pPr>
+            <w:r>
+              <w:rPr>
+                <w:rFonts w:hint="default" w:ascii="Times New Roman" w:hAnsi="Times New Roman" w:eastAsia="SimSun" w:cs="Times New Roman"/>
+                <w:kern w:val="0"/>
+                <w:sz w:val="24"/>
+                <w:szCs w:val="24"/>
+                <w:lang w:val="en-US" w:eastAsia="zh-CN" w:bidi="ar"/>
+              </w:rPr>
+              <w:t>Интеграция с CI/CD</w:t>
+            </w:r>
+          </w:p>
+        </w:tc>
+        <w:tc>
+          <w:tcPr>
+            <w:tcW w:w="0" w:type="auto"/>
+            <w:shd w:val="clear"/>
+            <w:vAlign w:val="center"/>
+          </w:tcPr>
+          <w:p>
+            <w:pPr>
+              <w:keepNext w:val="0"/>
+              <w:keepLines w:val="0"/>
+              <w:widowControl/>
+              <w:suppressLineNumbers w:val="0"/>
+              <w:spacing w:line="360" w:lineRule="auto"/>
+              <w:jc w:val="left"/>
+              <w:rPr>
+                <w:rFonts w:hint="default" w:ascii="Times New Roman" w:hAnsi="Times New Roman" w:cs="Times New Roman"/>
+                <w:sz w:val="24"/>
+                <w:szCs w:val="24"/>
+              </w:rPr>
+            </w:pPr>
+            <w:r>
+              <w:rPr>
+                <w:rFonts w:hint="default" w:ascii="Times New Roman" w:hAnsi="Times New Roman" w:eastAsia="SimSun" w:cs="Times New Roman"/>
+                <w:kern w:val="0"/>
+                <w:sz w:val="24"/>
+                <w:szCs w:val="24"/>
+                <w:lang w:val="en-US" w:eastAsia="zh-CN" w:bidi="ar"/>
+              </w:rPr>
+              <w:t>Возможность автоматического запуска тестов в процессе сборки</w:t>
+            </w:r>
+          </w:p>
+        </w:tc>
+        <w:tc>
+          <w:tcPr>
+            <w:tcW w:w="0" w:type="auto"/>
+            <w:shd w:val="clear"/>
+            <w:vAlign w:val="center"/>
+          </w:tcPr>
+          <w:p>
+            <w:pPr>
+              <w:keepNext w:val="0"/>
+              <w:keepLines w:val="0"/>
+              <w:widowControl/>
+              <w:suppressLineNumbers w:val="0"/>
+              <w:spacing w:line="360" w:lineRule="auto"/>
+              <w:jc w:val="left"/>
+              <w:rPr>
+                <w:rFonts w:hint="default" w:ascii="Times New Roman" w:hAnsi="Times New Roman" w:cs="Times New Roman"/>
+                <w:sz w:val="24"/>
+                <w:szCs w:val="24"/>
+              </w:rPr>
+            </w:pPr>
+            <w:r>
+              <w:rPr>
+                <w:rFonts w:hint="default" w:ascii="Times New Roman" w:hAnsi="Times New Roman" w:eastAsia="SimSun" w:cs="Times New Roman"/>
+                <w:kern w:val="0"/>
+                <w:sz w:val="24"/>
+                <w:szCs w:val="24"/>
+                <w:lang w:val="en-US" w:eastAsia="zh-CN" w:bidi="ar"/>
+              </w:rPr>
+              <w:t>Быстрое выявление ошибок и повышение качества релизов</w:t>
+            </w:r>
+          </w:p>
+        </w:tc>
+      </w:tr>
+      <w:tr>
+        <w:tblPrEx>
+          <w:tblBorders>
+            <w:top w:val="single" w:color="auto" w:sz="4" w:space="0"/>
+            <w:left w:val="single" w:color="auto" w:sz="4" w:space="0"/>
+            <w:bottom w:val="single" w:color="auto" w:sz="4" w:space="0"/>
+            <w:right w:val="single" w:color="auto" w:sz="4" w:space="0"/>
+            <w:insideH w:val="single" w:color="auto" w:sz="4" w:space="0"/>
+            <w:insideV w:val="single" w:color="auto" w:sz="4" w:space="0"/>
+          </w:tblBorders>
+          <w:tblCellMar>
+            <w:top w:w="15" w:type="dxa"/>
+            <w:left w:w="15" w:type="dxa"/>
+            <w:bottom w:w="15" w:type="dxa"/>
+            <w:right w:w="15" w:type="dxa"/>
+          </w:tblCellMar>
+        </w:tblPrEx>
+        <w:trPr>
+          <w:tblCellSpacing w:w="15" w:type="dxa"/>
+          <w:jc w:val="center"/>
+        </w:trPr>
+        <w:tc>
+          <w:tcPr>
+            <w:tcW w:w="0" w:type="auto"/>
+            <w:shd w:val="clear"/>
+            <w:vAlign w:val="center"/>
+          </w:tcPr>
+          <w:p>
+            <w:pPr>
+              <w:keepNext w:val="0"/>
+              <w:keepLines w:val="0"/>
+              <w:widowControl/>
+              <w:suppressLineNumbers w:val="0"/>
+              <w:spacing w:line="360" w:lineRule="auto"/>
+              <w:jc w:val="left"/>
+              <w:rPr>
+                <w:rFonts w:hint="default" w:ascii="Times New Roman" w:hAnsi="Times New Roman" w:cs="Times New Roman"/>
+                <w:sz w:val="24"/>
+                <w:szCs w:val="24"/>
+              </w:rPr>
+            </w:pPr>
+            <w:r>
+              <w:rPr>
+                <w:rFonts w:hint="default" w:ascii="Times New Roman" w:hAnsi="Times New Roman" w:eastAsia="SimSun" w:cs="Times New Roman"/>
+                <w:kern w:val="0"/>
+                <w:sz w:val="24"/>
+                <w:szCs w:val="24"/>
+                <w:lang w:val="en-US" w:eastAsia="zh-CN" w:bidi="ar"/>
+              </w:rPr>
+              <w:t>Поддержка отчётности</w:t>
+            </w:r>
+          </w:p>
+        </w:tc>
+        <w:tc>
+          <w:tcPr>
+            <w:tcW w:w="0" w:type="auto"/>
+            <w:shd w:val="clear"/>
+            <w:vAlign w:val="center"/>
+          </w:tcPr>
+          <w:p>
+            <w:pPr>
+              <w:keepNext w:val="0"/>
+              <w:keepLines w:val="0"/>
+              <w:widowControl/>
+              <w:suppressLineNumbers w:val="0"/>
+              <w:spacing w:line="360" w:lineRule="auto"/>
+              <w:jc w:val="left"/>
+              <w:rPr>
+                <w:rFonts w:hint="default" w:ascii="Times New Roman" w:hAnsi="Times New Roman" w:cs="Times New Roman"/>
+                <w:sz w:val="24"/>
+                <w:szCs w:val="24"/>
+              </w:rPr>
+            </w:pPr>
+            <w:r>
+              <w:rPr>
+                <w:rFonts w:hint="default" w:ascii="Times New Roman" w:hAnsi="Times New Roman" w:eastAsia="SimSun" w:cs="Times New Roman"/>
+                <w:kern w:val="0"/>
+                <w:sz w:val="24"/>
+                <w:szCs w:val="24"/>
+                <w:lang w:val="en-US" w:eastAsia="zh-CN" w:bidi="ar"/>
+              </w:rPr>
+              <w:t>Формирование наглядных отчётов о результатах тестирования</w:t>
+            </w:r>
+          </w:p>
+        </w:tc>
+        <w:tc>
+          <w:tcPr>
+            <w:tcW w:w="0" w:type="auto"/>
+            <w:shd w:val="clear"/>
+            <w:vAlign w:val="center"/>
+          </w:tcPr>
+          <w:p>
+            <w:pPr>
+              <w:keepNext w:val="0"/>
+              <w:keepLines w:val="0"/>
+              <w:widowControl/>
+              <w:suppressLineNumbers w:val="0"/>
+              <w:spacing w:line="360" w:lineRule="auto"/>
+              <w:jc w:val="left"/>
+              <w:rPr>
+                <w:rFonts w:hint="default" w:ascii="Times New Roman" w:hAnsi="Times New Roman" w:cs="Times New Roman"/>
+                <w:sz w:val="24"/>
+                <w:szCs w:val="24"/>
+              </w:rPr>
+            </w:pPr>
+            <w:r>
+              <w:rPr>
+                <w:rFonts w:hint="default" w:ascii="Times New Roman" w:hAnsi="Times New Roman" w:eastAsia="SimSun" w:cs="Times New Roman"/>
+                <w:kern w:val="0"/>
+                <w:sz w:val="24"/>
+                <w:szCs w:val="24"/>
+                <w:lang w:val="en-US" w:eastAsia="zh-CN" w:bidi="ar"/>
+              </w:rPr>
+              <w:t>Упрощение анализа дефектов и контроля качества</w:t>
+            </w:r>
+          </w:p>
+        </w:tc>
+      </w:tr>
+      <w:tr>
+        <w:tblPrEx>
+          <w:tblBorders>
+            <w:top w:val="single" w:color="auto" w:sz="4" w:space="0"/>
+            <w:left w:val="single" w:color="auto" w:sz="4" w:space="0"/>
+            <w:bottom w:val="single" w:color="auto" w:sz="4" w:space="0"/>
+            <w:right w:val="single" w:color="auto" w:sz="4" w:space="0"/>
+            <w:insideH w:val="single" w:color="auto" w:sz="4" w:space="0"/>
+            <w:insideV w:val="single" w:color="auto" w:sz="4" w:space="0"/>
+          </w:tblBorders>
+          <w:tblCellMar>
+            <w:top w:w="15" w:type="dxa"/>
+            <w:left w:w="15" w:type="dxa"/>
+            <w:bottom w:w="15" w:type="dxa"/>
+            <w:right w:w="15" w:type="dxa"/>
+          </w:tblCellMar>
+        </w:tblPrEx>
+        <w:trPr>
+          <w:tblCellSpacing w:w="15" w:type="dxa"/>
+          <w:jc w:val="center"/>
+        </w:trPr>
+        <w:tc>
+          <w:tcPr>
+            <w:tcW w:w="0" w:type="auto"/>
+            <w:shd w:val="clear"/>
+            <w:vAlign w:val="center"/>
+          </w:tcPr>
+          <w:p>
+            <w:pPr>
+              <w:keepNext w:val="0"/>
+              <w:keepLines w:val="0"/>
+              <w:widowControl/>
+              <w:suppressLineNumbers w:val="0"/>
+              <w:spacing w:line="360" w:lineRule="auto"/>
+              <w:jc w:val="left"/>
+              <w:rPr>
+                <w:rFonts w:hint="default" w:ascii="Times New Roman" w:hAnsi="Times New Roman" w:cs="Times New Roman"/>
+                <w:sz w:val="24"/>
+                <w:szCs w:val="24"/>
+              </w:rPr>
+            </w:pPr>
+            <w:r>
+              <w:rPr>
+                <w:rFonts w:hint="default" w:ascii="Times New Roman" w:hAnsi="Times New Roman" w:eastAsia="SimSun" w:cs="Times New Roman"/>
+                <w:kern w:val="0"/>
+                <w:sz w:val="24"/>
+                <w:szCs w:val="24"/>
+                <w:lang w:val="en-US" w:eastAsia="zh-CN" w:bidi="ar"/>
+              </w:rPr>
+              <w:t>Параллельный запуск тестов</w:t>
+            </w:r>
+          </w:p>
+        </w:tc>
+        <w:tc>
+          <w:tcPr>
+            <w:tcW w:w="0" w:type="auto"/>
+            <w:shd w:val="clear"/>
+            <w:vAlign w:val="center"/>
+          </w:tcPr>
+          <w:p>
+            <w:pPr>
+              <w:keepNext w:val="0"/>
+              <w:keepLines w:val="0"/>
+              <w:widowControl/>
+              <w:suppressLineNumbers w:val="0"/>
+              <w:spacing w:line="360" w:lineRule="auto"/>
+              <w:jc w:val="left"/>
+              <w:rPr>
+                <w:rFonts w:hint="default" w:ascii="Times New Roman" w:hAnsi="Times New Roman" w:cs="Times New Roman"/>
+                <w:sz w:val="24"/>
+                <w:szCs w:val="24"/>
+              </w:rPr>
+            </w:pPr>
+            <w:r>
+              <w:rPr>
+                <w:rFonts w:hint="default" w:ascii="Times New Roman" w:hAnsi="Times New Roman" w:eastAsia="SimSun" w:cs="Times New Roman"/>
+                <w:kern w:val="0"/>
+                <w:sz w:val="24"/>
+                <w:szCs w:val="24"/>
+                <w:lang w:val="en-US" w:eastAsia="zh-CN" w:bidi="ar"/>
+              </w:rPr>
+              <w:t>Возможность одновременного выполнения нескольких тестов</w:t>
+            </w:r>
+          </w:p>
+        </w:tc>
+        <w:tc>
+          <w:tcPr>
+            <w:tcW w:w="0" w:type="auto"/>
+            <w:shd w:val="clear"/>
+            <w:vAlign w:val="center"/>
+          </w:tcPr>
+          <w:p>
+            <w:pPr>
+              <w:keepNext w:val="0"/>
+              <w:keepLines w:val="0"/>
+              <w:widowControl/>
+              <w:suppressLineNumbers w:val="0"/>
+              <w:spacing w:line="360" w:lineRule="auto"/>
+              <w:jc w:val="left"/>
+              <w:rPr>
+                <w:rFonts w:hint="default" w:ascii="Times New Roman" w:hAnsi="Times New Roman" w:cs="Times New Roman"/>
+                <w:sz w:val="24"/>
+                <w:szCs w:val="24"/>
+              </w:rPr>
+            </w:pPr>
+            <w:r>
+              <w:rPr>
+                <w:rFonts w:hint="default" w:ascii="Times New Roman" w:hAnsi="Times New Roman" w:eastAsia="SimSun" w:cs="Times New Roman"/>
+                <w:kern w:val="0"/>
+                <w:sz w:val="24"/>
+                <w:szCs w:val="24"/>
+                <w:lang w:val="en-US" w:eastAsia="zh-CN" w:bidi="ar"/>
+              </w:rPr>
+              <w:t>Сокращение времени тестирования</w:t>
+            </w:r>
+          </w:p>
+        </w:tc>
+      </w:tr>
+    </w:tbl>
+    <w:p>
+      <w:pPr>
+        <w:numPr>
+          <w:ilvl w:val="0"/>
+          <w:numId w:val="0"/>
+        </w:numPr>
+        <w:spacing w:after="160" w:line="360" w:lineRule="auto"/>
+        <w:jc w:val="both"/>
+        <w:rPr>
+          <w:rFonts w:hint="default" w:ascii="Times New Roman" w:hAnsi="Times New Roman"/>
+          <w:b w:val="0"/>
+          <w:bCs w:val="0"/>
+          <w:sz w:val="28"/>
+          <w:szCs w:val="28"/>
+          <w:lang w:val="ru-RU"/>
+        </w:rPr>
+      </w:pPr>
     </w:p>
     <w:p>
       <w:pPr>
@@ -5970,6 +9825,12 @@
       <w:footerReference r:id="rId5" w:type="default"/>
       <w:pgSz w:w="11906" w:h="16838"/>
       <w:pgMar w:top="1134" w:right="850" w:bottom="1134" w:left="1701" w:header="708" w:footer="708" w:gutter="0"/>
+      <w:pgBorders>
+        <w:top w:val="none" w:sz="0" w:space="0"/>
+        <w:left w:val="none" w:sz="0" w:space="0"/>
+        <w:bottom w:val="none" w:sz="0" w:space="0"/>
+        <w:right w:val="none" w:sz="0" w:space="0"/>
+      </w:pgBorders>
       <w:cols w:space="708" w:num="1"/>
       <w:titlePg/>
       <w:docGrid w:linePitch="360" w:charSpace="0"/>

</xml_diff>